<commit_message>
Whitepaper brought level with the paper: tax and volatility, network-boundary bound, levels benchmark; abstract wording aligned
Co-Authored-By: Claude Fable 5.1 <noreply@anthropic.com>
</commit_message>
<xml_diff>
--- a/paper/Coops vs Bancos (Basileia) - White Paper 2026 (1).docx
+++ b/paper/Coops vs Bancos (Basileia) - White Paper 2026 (1).docx
@@ -1345,7 +1345,7 @@
         <w:rPr>
           <w:lang w:val="pt-BR"/>
         </w:rPr>
-        <w:t>. As contas de resultado são acumuladas dentro do semestre, porque as instituições levantam balanço em junho e dezembro; os valores foram desacumulados e anualizados. O resultado de intermediação financeira é informado líquido das despesas de provisão para créditos de liquidação duvidosa e foi recomposto antes dessas despesas, para que a margem e o índice de eficiência não reproduzam o resultado de provisão sob outra denominação.</w:t>
+        <w:t>. As contas de resultado são acumuladas dentro do semestre, porque as instituições levantam balanço em junho e dezembro; os valores foram desacumulados e anualizados. O resultado de intermediação financeira é informado líquido das despesas de provisão para créditos de liquidação duvidosa e foi recomposto antes dessas despesas, para que a margem e o índice de eficiência não reproduzam o resultado de provisão sob outra denominação. Os níveis desacumulados coincidem com os dados publicados pelo Banco Central: o retorno anualizado mediano das cooperativas singulares do painel é de 2,9% em 2023 e de 2,5% em 2024, contra 2,9% e 2,4% no Panorama do Sistema Nacional de Crédito Cooperativo.</w:t>
       </w:r>
     </w:p>
     <w:p>
@@ -1475,7 +1475,7 @@
         <w:rPr>
           <w:lang w:val="pt-BR"/>
         </w:rPr>
-        <w:t>Os retornos das cooperativas também oscilam menos. Em porte comparável, o desvio-padrão do ROA é menor e o z-score é maior, nas quatro especificações e em todos os grupos nacionais de comparação. O quadro é de retorno líquido mais alto e mais estável, obtido sobre a mesma margem de intermediação.</w:t>
+        <w:t>Os retornos das cooperativas também oscilam menos. Em porte comparável, o desvio-padrão do ROA é menor e o z-score é maior, nas quatro especificações e em todos os grupos nacionais de comparação. O quadro é de retorno líquido mais alto e mais estável, obtido sobre a mesma margem de intermediação. Os tributos também comprimem a volatilidade dos retornos líquidos dos bancos, de modo que a comparação após impostos tende a subestimar a diferença de estabilidade. Antes da tributação, a diferença de z-score é maior e a diferença mediana de volatilidade do ROA quase dobra; a diferença média de volatilidade é menor, e ambas mantêm sinal e significância.</w:t>
       </w:r>
     </w:p>
     <w:p>
@@ -4513,6 +4513,22 @@
           <w:lang w:val="pt-BR"/>
         </w:rPr>
         <w:t xml:space="preserve"> em cada um deles. As seis cooperativas independentes correspondem a apenas cinco grupos tratados, e a diferença de capital estimada para elas é positiva e não se distingue de ruído estatístico. A divisão por sistema localiza a diferença de capital nos dois grandes sistemas, mas não a explica. Uma explicação possível é o suporte do sistema: uma cooperativa que conta com centralização financeira e gestão consolidada de riscos pode operar com um colchão individual mais fino. Os sistemas também diferem quanto ao porte, à distribuição geográfica, ao perfil de negócios e à governança das filiadas, e a análise não separa o efeito do suporte desses fatores. A diferença de provisionamento não é significativa em nenhum dos sistemas.</w:t>
+      </w:r>
+    </w:p>
+    <w:p>
+      <w:pPr>
+        <w:spacing w:after="120"/>
+        <w:ind w:firstLine="720"/>
+        <w:jc w:val="both"/>
+        <w:rPr>
+          <w:lang w:val="pt-BR"/>
+        </w:rPr>
+      </w:pPr>
+      <w:r>
+        <w:rPr>
+          <w:lang w:val="pt-BR"/>
+        </w:rPr>
+        <w:t xml:space="preserve">A comparação também atravessa uma fronteira. Os bancos entram em parte como conglomerados prudenciais; as cooperativas entram como singulares, e as centrais ficam de fora. Uma agregação em nível de sistema está fora do alcance do IF.data, que vincula a singular ao seu sistema, mas não à sua central. A assimetria pode ser dimensionada. Ao final de 2024, as centrais detinham cerca de um quarto dos ativos das singulares, em grande parte os depósitos das próprias singulares na centralização financeira, mas cerca de 6% do seu capital regulamentar e cerca de um décimo das suas despesas administrativas e de pessoal; e as taxas que a singular paga à central são registradas como despesas administrativas da própria singular. A consolidação das centrais tenderia, portanto, a deslocar as diferenças de capital e de custo em magnitude muito inferior ao seu tamanho.</w:t>
       </w:r>
     </w:p>
     <w:p>

</xml_diff>

<commit_message>
Full path: pre-tax return on assets as a primary outcome; paper reframed around two channels
- paper.py: roa_pretax (4 x line g / assets) joins OUTCOMES; income map carries lines g, h, k
- Table 2, quantile Table 3, survival Table 4, ladder figure and supplement tables carry both
  profitability rows (after tax stable, before tax null); t15 replaces t13; gate_e counts seven
- Section 1 fiscal-channel paragraph (Laws 5.764/1971 and 10.865/2004), 3.3 defines both measures,
  4.1 profitability paragraph, Section 6 fiscal paragraph; abstract and plain-language box aligned
- expanded_abstract.md and both ICA docx rebuilt; whitepaper carries the two-channel wording,
  the ato cooperativo paragraph and a new recommendation; README and cuts to stay under 8,000 words

Co-Authored-By: Claude Fable 5.1 <noreply@anthropic.com>
</commit_message>
<xml_diff>
--- a/paper/Coops vs Bancos (Basileia) - White Paper 2026 (1).docx
+++ b/paper/Coops vs Bancos (Basileia) - White Paper 2026 (1).docx
@@ -248,7 +248,7 @@
           <w:color w:val="000000"/>
           <w:lang w:val="pt-BR"/>
         </w:rPr>
-        <w:t xml:space="preserve"> que os bancos; o retorno sobre o ativo também é </w:t>
+        <w:t xml:space="preserve"> que os bancos. Antes dos tributos, o retorno sobre o ativo é </w:t>
       </w:r>
       <w:r>
         <w:rPr>
@@ -257,14 +257,30 @@
           <w:color w:val="000000"/>
           <w:lang w:val="pt-BR"/>
         </w:rPr>
-        <w:t xml:space="preserve">maior após impostos</w:t>
+        <w:t xml:space="preserve">semelhante ao dos bancos</w:t>
       </w:r>
       <w:r>
         <w:rPr>
           <w:color w:val="000000"/>
           <w:lang w:val="pt-BR"/>
         </w:rPr>
-        <w:t xml:space="preserve">, e parte dessa diferença vem da isenção tributária do ato cooperativo; na média, coops têm menos capital, mas porque a média dos bancos é puxada para cima por bancos pequenos com capital muito acima do exigido.</w:t>
+        <w:t xml:space="preserve">; depois deles, a cooperativa </w:t>
+      </w:r>
+      <w:r>
+        <w:rPr>
+          <w:b/>
+          <w:bCs/>
+          <w:color w:val="000000"/>
+          <w:lang w:val="pt-BR"/>
+        </w:rPr>
+        <w:t xml:space="preserve">retém mais</w:t>
+      </w:r>
+      <w:r>
+        <w:rPr>
+          <w:color w:val="000000"/>
+          <w:lang w:val="pt-BR"/>
+        </w:rPr>
+        <w:t xml:space="preserve">, porque o ato cooperativo é isento de IRPJ e CSLL, e o que ela retém é o único capital que pode construir. Na média, coops têm menos capital, mas porque a média dos bancos é puxada para cima por bancos pequenos com capital muito acima do exigido.</w:t>
       </w:r>
     </w:p>
     <w:p>
@@ -402,13 +418,13 @@
           <w:bCs/>
           <w:lang w:val="pt-BR"/>
         </w:rPr>
-        <w:t xml:space="preserve">operam com custo menor, apresentam retornos mais estáveis</w:t>
-      </w:r>
-      <w:r>
-        <w:rPr>
-          <w:lang w:val="pt-BR"/>
-        </w:rPr>
-        <w:t xml:space="preserve"> e obtêm </w:t>
+        <w:t xml:space="preserve">operam com custo menor e apresentam retornos mais estáveis</w:t>
+      </w:r>
+      <w:r>
+        <w:rPr>
+          <w:lang w:val="pt-BR"/>
+        </w:rPr>
+        <w:t xml:space="preserve">; antes dos tributos, o retorno sobre o ativo é semelhante ao dos bancos e, depois deles, cerca de dois pontos percentuais maior, em boa parte pela </w:t>
       </w:r>
       <w:r>
         <w:rPr>
@@ -416,13 +432,13 @@
           <w:bCs/>
           <w:lang w:val="pt-BR"/>
         </w:rPr>
-        <w:t xml:space="preserve">retorno sobre o ativo mais alto após impostos</w:t>
-      </w:r>
-      <w:r>
-        <w:rPr>
-          <w:lang w:val="pt-BR"/>
-        </w:rPr>
-        <w:t xml:space="preserve">. A isenção tributária do ato cooperativo explica parte dessa última diferença.</w:t>
+        <w:t xml:space="preserve">isenção tributária do ato cooperativo</w:t>
+      </w:r>
+      <w:r>
+        <w:rPr>
+          <w:lang w:val="pt-BR"/>
+        </w:rPr>
+        <w:t xml:space="preserve">.</w:t>
       </w:r>
     </w:p>
     <w:p>
@@ -1141,7 +1157,7 @@
         <w:rPr>
           <w:lang w:val="pt-BR"/>
         </w:rPr>
-        <w:t>Retorno sobre o ativo (ROA), anualizado.</w:t>
+        <w:t xml:space="preserve">Retorno sobre o ativo (ROA), anualizado, após e antes dos tributos.</w:t>
       </w:r>
     </w:p>
     <w:p>
@@ -1443,7 +1459,7 @@
         <w:rPr>
           <w:lang w:val="pt-BR"/>
         </w:rPr>
-        <w:t>Cinco dos oito indicadores trimestrais mantêm sinal e significância nas quatro especificações e em todas as regras de tratamento de valores extremos. Em porte comparável, as cooperativas destinam às operações de crédito uma parcela do ativo cerca de um quinto maior que a dos bancos, e a diferença é ainda maior na mediana. O retorno sobre o ativo supera o dos bancos em cerca de dois pontos percentuais, diferença expressiva para os padrões da literatura bancária. A margem de intermediação não difere da dos bancos, de modo que o retorno maior decorre do volume de crédito e do menor custo operacional. As cooperativas operam com custo menor, embora a magnitude dessa diferença dependa dos valores extremos, já que o denominador do índice se aproxima de zero em bancos com pouca intermediação. A mediana condicional, cujo intervalo de confiança exclui zero, é a medida mais confiável.</w:t>
+        <w:t xml:space="preserve">Cinco dos nove indicadores trimestrais mantêm sinal e significância nas quatro especificações e em todas as regras de tratamento de valores extremos. Em porte comparável, as cooperativas destinam às operações de crédito uma parcela do ativo cerca de um quinto maior que a dos bancos, e a diferença é ainda maior na mediana. As cooperativas operam com custo menor, embora a magnitude dessa diferença dependa dos valores extremos, já que o denominador do índice se aproxima de zero em bancos com pouca intermediação. A mediana condicional, cujo intervalo de confiança exclui zero, é a medida mais confiável.</w:t>
       </w:r>
     </w:p>
     <w:p>
@@ -1459,7 +1475,7 @@
         <w:rPr>
           <w:lang w:val="pt-BR"/>
         </w:rPr>
-        <w:t xml:space="preserve">Parte da diferença de retorno é tributária. O lucro líquido informado no IF.data é apurado após o imposto de renda e a contribuição social, dos quais o ato cooperativo é isento. Entre os trimestres com resultado positivo antes dos tributos, a alíquota efetiva mediana é de cerca de um terço para os bancos e próxima de zero para as cooperativas. Reestimada sobre o resultado antes da tributação, a diferença com controle de porte cai para cerca de três quintos do valor após impostos e continua significativa; na mediana condicional, conserva cerca de cinco sextos. Na faixa de porte comum aos dois grupos, porém, a diferença antes dos tributos não se distingue de zero. O retorno após impostos é o que se acumula como capital, e é ele que a Tabela 1 apresenta; a leitura correta é a de uma diferença de rentabilidade líquida de tributos.</w:t>
+        <w:t xml:space="preserve">A rentabilidade se divide em dois canais, e a Tabela 1 traz os dois. Antes dos tributos, a diferença de retorno sobre o ativo é positiva nas quatro especificações, mas significativa apenas nas duas primeiras, e por isso é classificada como nula: em termos operacionais, as maiores cooperativas ganham aproximadamente o que ganham os bancos de mesmo porte, sobre uma margem de intermediação que não difere da deles. Depois dos tributos, a diferença é de cerca de dois pontos percentuais com controle de porte, significativa em todas as especificações e estável. A distância entre as duas linhas é a isenção do ato cooperativo: entre os trimestres com resultado positivo antes dos tributos, a alíquota efetiva mediana de IRPJ e CSLL é de cerca de um terço para os bancos e próxima de zero para as cooperativas, e a diferença antes dos tributos equivale a cerca de três quintos da diferença depois deles. A linha após impostos mede o que a cooperativa retém, o retorno que se acumula como capital; a linha antes dos impostos é a comparação operacional.</w:t>
       </w:r>
     </w:p>
     <w:p>
@@ -1512,11 +1528,11 @@
         <w:tblW w:w="9638" w:type="dxa"/>
         <w:jc w:val="center"/>
         <w:tblBorders>
-          <w:top w:val="single" w:color="A6A6A6" w:sz="4" w:space="0"/>
+          <w:top w:val="single" w:sz="4" w:space="0" w:color="A6A6A6"/>
+          <w:bottom w:val="single" w:sz="4" w:space="0" w:color="A6A6A6"/>
+          <w:insideH w:val="single" w:sz="4" w:space="0" w:color="A6A6A6"/>
           <w:left w:val="nil"/>
-          <w:bottom w:val="single" w:color="A6A6A6" w:sz="4" w:space="0"/>
           <w:right w:val="nil"/>
-          <w:insideH w:val="single" w:color="A6A6A6" w:sz="4" w:space="0"/>
           <w:insideV w:val="nil"/>
         </w:tblBorders>
         <w:tblLayout w:type="fixed"/>
@@ -1538,7 +1554,6 @@
       <w:tr>
         <w:trPr>
           <w:tblHeader/>
-          <w:jc w:val="center"/>
         </w:trPr>
         <w:tc>
           <w:tcPr>
@@ -1551,8 +1566,9 @@
               <w:keepNext/>
               <w:keepLines/>
               <w:spacing w:before="30" w:after="30" w:line="240" w:lineRule="auto"/>
+              <w:ind w:firstLine="0"/>
+              <w:jc w:val="left"/>
             </w:pPr>
-            <w:proofErr w:type="spellStart"/>
             <w:r>
               <w:rPr>
                 <w:b/>
@@ -1560,9 +1576,8 @@
                 <w:sz w:val="16"/>
                 <w:szCs w:val="16"/>
               </w:rPr>
-              <w:t>Indicador</w:t>
-            </w:r>
-            <w:proofErr w:type="spellEnd"/>
+              <w:t xml:space="preserve">Indicador</w:t>
+            </w:r>
           </w:p>
         </w:tc>
         <w:tc>
@@ -1576,6 +1591,7 @@
               <w:keepNext/>
               <w:keepLines/>
               <w:spacing w:before="30" w:after="30" w:line="240" w:lineRule="auto"/>
+              <w:ind w:firstLine="0"/>
               <w:jc w:val="right"/>
             </w:pPr>
             <w:r>
@@ -1585,19 +1601,8 @@
                 <w:sz w:val="16"/>
                 <w:szCs w:val="16"/>
               </w:rPr>
-              <w:t xml:space="preserve">(1) Sem </w:t>
-            </w:r>
-            <w:proofErr w:type="spellStart"/>
-            <w:r>
-              <w:rPr>
-                <w:b/>
-                <w:bCs/>
-                <w:sz w:val="16"/>
-                <w:szCs w:val="16"/>
-              </w:rPr>
-              <w:t>controles</w:t>
-            </w:r>
-            <w:proofErr w:type="spellEnd"/>
+              <w:t xml:space="preserve">(1) Sem controles</w:t>
+            </w:r>
           </w:p>
         </w:tc>
         <w:tc>
@@ -1611,6 +1616,7 @@
               <w:keepNext/>
               <w:keepLines/>
               <w:spacing w:before="30" w:after="30" w:line="240" w:lineRule="auto"/>
+              <w:ind w:firstLine="0"/>
               <w:jc w:val="right"/>
             </w:pPr>
             <w:r>
@@ -1620,19 +1626,8 @@
                 <w:sz w:val="16"/>
                 <w:szCs w:val="16"/>
               </w:rPr>
-              <w:t xml:space="preserve">(2) Porte e </w:t>
-            </w:r>
-            <w:proofErr w:type="spellStart"/>
-            <w:r>
-              <w:rPr>
-                <w:b/>
-                <w:bCs/>
-                <w:sz w:val="16"/>
-                <w:szCs w:val="16"/>
-              </w:rPr>
-              <w:t>trimestre</w:t>
-            </w:r>
-            <w:proofErr w:type="spellEnd"/>
+              <w:t xml:space="preserve">(2) Porte e trimestre</w:t>
+            </w:r>
           </w:p>
         </w:tc>
         <w:tc>
@@ -1646,6 +1641,7 @@
               <w:keepNext/>
               <w:keepLines/>
               <w:spacing w:before="30" w:after="30" w:line="240" w:lineRule="auto"/>
+              <w:ind w:firstLine="0"/>
               <w:jc w:val="right"/>
             </w:pPr>
             <w:r>
@@ -1655,19 +1651,8 @@
                 <w:sz w:val="16"/>
                 <w:szCs w:val="16"/>
               </w:rPr>
-              <w:t xml:space="preserve">(3) </w:t>
-            </w:r>
-            <w:proofErr w:type="spellStart"/>
-            <w:r>
-              <w:rPr>
-                <w:b/>
-                <w:bCs/>
-                <w:sz w:val="16"/>
-                <w:szCs w:val="16"/>
-              </w:rPr>
-              <w:t>Pareado</w:t>
-            </w:r>
-            <w:proofErr w:type="spellEnd"/>
+              <w:t xml:space="preserve">(3) Pareado</w:t>
+            </w:r>
           </w:p>
         </w:tc>
         <w:tc>
@@ -1681,6 +1666,7 @@
               <w:keepNext/>
               <w:keepLines/>
               <w:spacing w:before="30" w:after="30" w:line="240" w:lineRule="auto"/>
+              <w:ind w:firstLine="0"/>
               <w:jc w:val="right"/>
             </w:pPr>
             <w:r>
@@ -1690,39 +1676,8 @@
                 <w:sz w:val="16"/>
                 <w:szCs w:val="16"/>
               </w:rPr>
-              <w:t xml:space="preserve">(4) </w:t>
-            </w:r>
-            <w:proofErr w:type="spellStart"/>
-            <w:r>
-              <w:rPr>
-                <w:b/>
-                <w:bCs/>
-                <w:sz w:val="16"/>
-                <w:szCs w:val="16"/>
-              </w:rPr>
-              <w:t>Suporte</w:t>
-            </w:r>
-            <w:proofErr w:type="spellEnd"/>
-            <w:r>
-              <w:rPr>
-                <w:b/>
-                <w:bCs/>
-                <w:sz w:val="16"/>
-                <w:szCs w:val="16"/>
-              </w:rPr>
-              <w:t xml:space="preserve"> </w:t>
-            </w:r>
-            <w:proofErr w:type="spellStart"/>
-            <w:r>
-              <w:rPr>
-                <w:b/>
-                <w:bCs/>
-                <w:sz w:val="16"/>
-                <w:szCs w:val="16"/>
-              </w:rPr>
-              <w:t>comum</w:t>
-            </w:r>
-            <w:proofErr w:type="spellEnd"/>
+              <w:t xml:space="preserve">(4) Suporte comum</w:t>
+            </w:r>
           </w:p>
         </w:tc>
         <w:tc>
@@ -1736,6 +1691,7 @@
               <w:keepNext/>
               <w:keepLines/>
               <w:spacing w:before="30" w:after="30" w:line="240" w:lineRule="auto"/>
+              <w:ind w:firstLine="0"/>
               <w:jc w:val="right"/>
             </w:pPr>
             <w:r>
@@ -1745,7 +1701,7 @@
                 <w:sz w:val="16"/>
                 <w:szCs w:val="16"/>
               </w:rPr>
-              <w:t>Mediana (2)</w:t>
+              <w:t xml:space="preserve">Mediana (2)</w:t>
             </w:r>
           </w:p>
         </w:tc>
@@ -1760,8 +1716,9 @@
               <w:keepNext/>
               <w:keepLines/>
               <w:spacing w:before="30" w:after="30" w:line="240" w:lineRule="auto"/>
+              <w:ind w:firstLine="0"/>
+              <w:jc w:val="left"/>
             </w:pPr>
-            <w:proofErr w:type="spellStart"/>
             <w:r>
               <w:rPr>
                 <w:b/>
@@ -1769,16 +1726,14 @@
                 <w:sz w:val="16"/>
                 <w:szCs w:val="16"/>
               </w:rPr>
-              <w:t>Classificação</w:t>
-            </w:r>
-            <w:proofErr w:type="spellEnd"/>
+              <w:t xml:space="preserve">Classificação</w:t>
+            </w:r>
           </w:p>
         </w:tc>
       </w:tr>
       <w:tr>
         <w:trPr>
           <w:cantSplit/>
-          <w:jc w:val="center"/>
         </w:trPr>
         <w:tc>
           <w:tcPr>
@@ -1790,35 +1745,15 @@
               <w:keepNext/>
               <w:keepLines/>
               <w:spacing w:before="30" w:after="30" w:line="240" w:lineRule="auto"/>
-              <w:rPr>
-                <w:lang w:val="pt-BR"/>
-              </w:rPr>
+              <w:ind w:firstLine="0"/>
+              <w:jc w:val="left"/>
             </w:pPr>
             <w:r>
               <w:rPr>
                 <w:sz w:val="16"/>
                 <w:szCs w:val="16"/>
-                <w:lang w:val="pt-BR"/>
-              </w:rPr>
-              <w:t>Índice de Basileia (</w:t>
-            </w:r>
-            <w:proofErr w:type="spellStart"/>
-            <w:r>
-              <w:rPr>
-                <w:sz w:val="16"/>
-                <w:szCs w:val="16"/>
-                <w:lang w:val="pt-BR"/>
-              </w:rPr>
-              <w:t>p.p</w:t>
-            </w:r>
-            <w:proofErr w:type="spellEnd"/>
-            <w:r>
-              <w:rPr>
-                <w:sz w:val="16"/>
-                <w:szCs w:val="16"/>
-                <w:lang w:val="pt-BR"/>
-              </w:rPr>
-              <w:t>.)</w:t>
+              </w:rPr>
+              <w:t xml:space="preserve">Índice de Basileia (p.p.)</w:t>
             </w:r>
           </w:p>
         </w:tc>
@@ -1832,6 +1767,7 @@
               <w:keepNext/>
               <w:keepLines/>
               <w:spacing w:before="30" w:after="30" w:line="240" w:lineRule="auto"/>
+              <w:ind w:firstLine="0"/>
               <w:jc w:val="right"/>
             </w:pPr>
             <w:r>
@@ -1839,7 +1775,7 @@
                 <w:sz w:val="16"/>
                 <w:szCs w:val="16"/>
               </w:rPr>
-              <w:t>−8,19</w:t>
+              <w:t xml:space="preserve">−8,19</w:t>
             </w:r>
             <w:r>
               <w:rPr>
@@ -1847,7 +1783,7 @@
                 <w:szCs w:val="16"/>
                 <w:vertAlign w:val="superscript"/>
               </w:rPr>
-              <w:t>***</w:t>
+              <w:t xml:space="preserve">***</w:t>
             </w:r>
           </w:p>
         </w:tc>
@@ -1861,6 +1797,7 @@
               <w:keepNext/>
               <w:keepLines/>
               <w:spacing w:before="30" w:after="30" w:line="240" w:lineRule="auto"/>
+              <w:ind w:firstLine="0"/>
               <w:jc w:val="right"/>
             </w:pPr>
             <w:r>
@@ -1868,7 +1805,7 @@
                 <w:sz w:val="16"/>
                 <w:szCs w:val="16"/>
               </w:rPr>
-              <w:t>−15,77</w:t>
+              <w:t xml:space="preserve">−15,77</w:t>
             </w:r>
             <w:r>
               <w:rPr>
@@ -1876,7 +1813,7 @@
                 <w:szCs w:val="16"/>
                 <w:vertAlign w:val="superscript"/>
               </w:rPr>
-              <w:t>***</w:t>
+              <w:t xml:space="preserve">***</w:t>
             </w:r>
           </w:p>
         </w:tc>
@@ -1890,6 +1827,7 @@
               <w:keepNext/>
               <w:keepLines/>
               <w:spacing w:before="30" w:after="30" w:line="240" w:lineRule="auto"/>
+              <w:ind w:firstLine="0"/>
               <w:jc w:val="right"/>
             </w:pPr>
             <w:r>
@@ -1897,7 +1835,7 @@
                 <w:sz w:val="16"/>
                 <w:szCs w:val="16"/>
               </w:rPr>
-              <w:t>−17,50</w:t>
+              <w:t xml:space="preserve">−17,50</w:t>
             </w:r>
             <w:r>
               <w:rPr>
@@ -1905,7 +1843,7 @@
                 <w:szCs w:val="16"/>
                 <w:vertAlign w:val="superscript"/>
               </w:rPr>
-              <w:t>***</w:t>
+              <w:t xml:space="preserve">***</w:t>
             </w:r>
           </w:p>
         </w:tc>
@@ -1919,6 +1857,7 @@
               <w:keepNext/>
               <w:keepLines/>
               <w:spacing w:before="30" w:after="30" w:line="240" w:lineRule="auto"/>
+              <w:ind w:firstLine="0"/>
               <w:jc w:val="right"/>
             </w:pPr>
             <w:r>
@@ -1926,7 +1865,7 @@
                 <w:sz w:val="16"/>
                 <w:szCs w:val="16"/>
               </w:rPr>
-              <w:t>−14,21</w:t>
+              <w:t xml:space="preserve">−14,21</w:t>
             </w:r>
             <w:r>
               <w:rPr>
@@ -1934,7 +1873,7 @@
                 <w:szCs w:val="16"/>
                 <w:vertAlign w:val="superscript"/>
               </w:rPr>
-              <w:t>***</w:t>
+              <w:t xml:space="preserve">***</w:t>
             </w:r>
           </w:p>
         </w:tc>
@@ -1948,6 +1887,7 @@
               <w:keepNext/>
               <w:keepLines/>
               <w:spacing w:before="30" w:after="30" w:line="240" w:lineRule="auto"/>
+              <w:ind w:firstLine="0"/>
               <w:jc w:val="right"/>
             </w:pPr>
             <w:r>
@@ -1955,7 +1895,7 @@
                 <w:sz w:val="16"/>
                 <w:szCs w:val="16"/>
               </w:rPr>
-              <w:t>−2,18</w:t>
+              <w:t xml:space="preserve">−2,18</w:t>
             </w:r>
           </w:p>
         </w:tc>
@@ -1969,39 +1909,22 @@
               <w:keepNext/>
               <w:keepLines/>
               <w:spacing w:before="30" w:after="30" w:line="240" w:lineRule="auto"/>
+              <w:ind w:firstLine="0"/>
+              <w:jc w:val="left"/>
             </w:pPr>
-            <w:proofErr w:type="spellStart"/>
-            <w:r>
-              <w:rPr>
-                <w:sz w:val="16"/>
-                <w:szCs w:val="16"/>
-              </w:rPr>
-              <w:t>estável</w:t>
-            </w:r>
-            <w:proofErr w:type="spellEnd"/>
-            <w:r>
-              <w:rPr>
-                <w:sz w:val="16"/>
-                <w:szCs w:val="16"/>
-              </w:rPr>
-              <w:t xml:space="preserve"> no </w:t>
-            </w:r>
-            <w:proofErr w:type="spellStart"/>
-            <w:r>
-              <w:rPr>
-                <w:sz w:val="16"/>
-                <w:szCs w:val="16"/>
-              </w:rPr>
-              <w:t>sinal</w:t>
-            </w:r>
-            <w:proofErr w:type="spellEnd"/>
+            <w:r>
+              <w:rPr>
+                <w:sz w:val="16"/>
+                <w:szCs w:val="16"/>
+              </w:rPr>
+              <w:t xml:space="preserve">estável no sinal</w:t>
+            </w:r>
           </w:p>
         </w:tc>
       </w:tr>
       <w:tr>
         <w:trPr>
           <w:cantSplit/>
-          <w:jc w:val="center"/>
         </w:trPr>
         <w:tc>
           <w:tcPr>
@@ -2013,16 +1936,16 @@
               <w:keepNext/>
               <w:keepLines/>
               <w:spacing w:before="30" w:after="30" w:line="240" w:lineRule="auto"/>
+              <w:ind w:firstLine="0"/>
+              <w:jc w:val="left"/>
             </w:pPr>
-            <w:proofErr w:type="spellStart"/>
-            <w:r>
-              <w:rPr>
-                <w:sz w:val="16"/>
-                <w:szCs w:val="16"/>
-              </w:rPr>
-              <w:t>Alavancagem</w:t>
-            </w:r>
-            <w:proofErr w:type="spellEnd"/>
+            <w:r>
+              <w:rPr>
+                <w:sz w:val="16"/>
+                <w:szCs w:val="16"/>
+              </w:rPr>
+              <w:t xml:space="preserve">Alavancagem</w:t>
+            </w:r>
           </w:p>
         </w:tc>
         <w:tc>
@@ -2035,6 +1958,7 @@
               <w:keepNext/>
               <w:keepLines/>
               <w:spacing w:before="30" w:after="30" w:line="240" w:lineRule="auto"/>
+              <w:ind w:firstLine="0"/>
               <w:jc w:val="right"/>
             </w:pPr>
             <w:r>
@@ -2042,7 +1966,7 @@
                 <w:sz w:val="16"/>
                 <w:szCs w:val="16"/>
               </w:rPr>
-              <w:t>0,0561</w:t>
+              <w:t xml:space="preserve">0,0561</w:t>
             </w:r>
             <w:r>
               <w:rPr>
@@ -2050,7 +1974,7 @@
                 <w:szCs w:val="16"/>
                 <w:vertAlign w:val="superscript"/>
               </w:rPr>
-              <w:t>**</w:t>
+              <w:t xml:space="preserve">**</w:t>
             </w:r>
           </w:p>
         </w:tc>
@@ -2064,6 +1988,7 @@
               <w:keepNext/>
               <w:keepLines/>
               <w:spacing w:before="30" w:after="30" w:line="240" w:lineRule="auto"/>
+              <w:ind w:firstLine="0"/>
               <w:jc w:val="right"/>
             </w:pPr>
             <w:r>
@@ -2071,7 +1996,7 @@
                 <w:sz w:val="16"/>
                 <w:szCs w:val="16"/>
               </w:rPr>
-              <w:t>0,1220</w:t>
+              <w:t xml:space="preserve">0,1220</w:t>
             </w:r>
             <w:r>
               <w:rPr>
@@ -2079,7 +2004,7 @@
                 <w:szCs w:val="16"/>
                 <w:vertAlign w:val="superscript"/>
               </w:rPr>
-              <w:t>***</w:t>
+              <w:t xml:space="preserve">***</w:t>
             </w:r>
           </w:p>
         </w:tc>
@@ -2093,6 +2018,7 @@
               <w:keepNext/>
               <w:keepLines/>
               <w:spacing w:before="30" w:after="30" w:line="240" w:lineRule="auto"/>
+              <w:ind w:firstLine="0"/>
               <w:jc w:val="right"/>
             </w:pPr>
             <w:r>
@@ -2100,7 +2026,7 @@
                 <w:sz w:val="16"/>
                 <w:szCs w:val="16"/>
               </w:rPr>
-              <w:t>0,1046</w:t>
+              <w:t xml:space="preserve">0,1046</w:t>
             </w:r>
             <w:r>
               <w:rPr>
@@ -2108,7 +2034,7 @@
                 <w:szCs w:val="16"/>
                 <w:vertAlign w:val="superscript"/>
               </w:rPr>
-              <w:t>***</w:t>
+              <w:t xml:space="preserve">***</w:t>
             </w:r>
           </w:p>
         </w:tc>
@@ -2122,6 +2048,7 @@
               <w:keepNext/>
               <w:keepLines/>
               <w:spacing w:before="30" w:after="30" w:line="240" w:lineRule="auto"/>
+              <w:ind w:firstLine="0"/>
               <w:jc w:val="right"/>
             </w:pPr>
             <w:r>
@@ -2129,7 +2056,7 @@
                 <w:sz w:val="16"/>
                 <w:szCs w:val="16"/>
               </w:rPr>
-              <w:t>0,0813</w:t>
+              <w:t xml:space="preserve">0,0813</w:t>
             </w:r>
             <w:r>
               <w:rPr>
@@ -2137,7 +2064,7 @@
                 <w:szCs w:val="16"/>
                 <w:vertAlign w:val="superscript"/>
               </w:rPr>
-              <w:t>***</w:t>
+              <w:t xml:space="preserve">***</w:t>
             </w:r>
           </w:p>
         </w:tc>
@@ -2151,6 +2078,7 @@
               <w:keepNext/>
               <w:keepLines/>
               <w:spacing w:before="30" w:after="30" w:line="240" w:lineRule="auto"/>
+              <w:ind w:firstLine="0"/>
               <w:jc w:val="right"/>
             </w:pPr>
             <w:r>
@@ -2158,7 +2086,7 @@
                 <w:sz w:val="16"/>
                 <w:szCs w:val="16"/>
               </w:rPr>
-              <w:t>0,0283</w:t>
+              <w:t xml:space="preserve">0,0283</w:t>
             </w:r>
           </w:p>
         </w:tc>
@@ -2172,39 +2100,22 @@
               <w:keepNext/>
               <w:keepLines/>
               <w:spacing w:before="30" w:after="30" w:line="240" w:lineRule="auto"/>
+              <w:ind w:firstLine="0"/>
+              <w:jc w:val="left"/>
             </w:pPr>
-            <w:proofErr w:type="spellStart"/>
-            <w:r>
-              <w:rPr>
-                <w:sz w:val="16"/>
-                <w:szCs w:val="16"/>
-              </w:rPr>
-              <w:t>estável</w:t>
-            </w:r>
-            <w:proofErr w:type="spellEnd"/>
-            <w:r>
-              <w:rPr>
-                <w:sz w:val="16"/>
-                <w:szCs w:val="16"/>
-              </w:rPr>
-              <w:t xml:space="preserve"> no </w:t>
-            </w:r>
-            <w:proofErr w:type="spellStart"/>
-            <w:r>
-              <w:rPr>
-                <w:sz w:val="16"/>
-                <w:szCs w:val="16"/>
-              </w:rPr>
-              <w:t>sinal</w:t>
-            </w:r>
-            <w:proofErr w:type="spellEnd"/>
+            <w:r>
+              <w:rPr>
+                <w:sz w:val="16"/>
+                <w:szCs w:val="16"/>
+              </w:rPr>
+              <w:t xml:space="preserve">estável no sinal</w:t>
+            </w:r>
           </w:p>
         </w:tc>
       </w:tr>
       <w:tr>
         <w:trPr>
           <w:cantSplit/>
-          <w:jc w:val="center"/>
         </w:trPr>
         <w:tc>
           <w:tcPr>
@@ -2216,48 +2127,16 @@
               <w:keepNext/>
               <w:keepLines/>
               <w:spacing w:before="30" w:after="30" w:line="240" w:lineRule="auto"/>
+              <w:ind w:firstLine="0"/>
+              <w:jc w:val="left"/>
             </w:pPr>
-            <w:proofErr w:type="spellStart"/>
-            <w:r>
-              <w:rPr>
-                <w:sz w:val="16"/>
-                <w:szCs w:val="16"/>
-              </w:rPr>
-              <w:t>Retorno</w:t>
-            </w:r>
-            <w:proofErr w:type="spellEnd"/>
-            <w:r>
-              <w:rPr>
-                <w:sz w:val="16"/>
-                <w:szCs w:val="16"/>
-              </w:rPr>
-              <w:t xml:space="preserve"> </w:t>
-            </w:r>
-            <w:proofErr w:type="spellStart"/>
-            <w:r>
-              <w:rPr>
-                <w:sz w:val="16"/>
-                <w:szCs w:val="16"/>
-              </w:rPr>
-              <w:t>sobre</w:t>
-            </w:r>
-            <w:proofErr w:type="spellEnd"/>
-            <w:r>
-              <w:rPr>
-                <w:sz w:val="16"/>
-                <w:szCs w:val="16"/>
-              </w:rPr>
-              <w:t xml:space="preserve"> o </w:t>
-            </w:r>
-            <w:proofErr w:type="spellStart"/>
-            <w:r>
-              <w:rPr>
-                <w:sz w:val="16"/>
-                <w:szCs w:val="16"/>
-              </w:rPr>
-              <w:t>ativo</w:t>
-            </w:r>
-            <w:proofErr w:type="spellEnd"/>
+            <w:r>
+              <w:rPr>
+                <w:sz w:val="16"/>
+                <w:szCs w:val="16"/>
+              </w:rPr>
+              <w:t xml:space="preserve">Retorno sobre o ativo, após tributos</w:t>
+            </w:r>
           </w:p>
         </w:tc>
         <w:tc>
@@ -2270,6 +2149,7 @@
               <w:keepNext/>
               <w:keepLines/>
               <w:spacing w:before="30" w:after="30" w:line="240" w:lineRule="auto"/>
+              <w:ind w:firstLine="0"/>
               <w:jc w:val="right"/>
             </w:pPr>
             <w:r>
@@ -2277,7 +2157,7 @@
                 <w:sz w:val="16"/>
                 <w:szCs w:val="16"/>
               </w:rPr>
-              <w:t>0,0181</w:t>
+              <w:t xml:space="preserve">0,0181</w:t>
             </w:r>
             <w:r>
               <w:rPr>
@@ -2285,7 +2165,7 @@
                 <w:szCs w:val="16"/>
                 <w:vertAlign w:val="superscript"/>
               </w:rPr>
-              <w:t>***</w:t>
+              <w:t xml:space="preserve">***</w:t>
             </w:r>
           </w:p>
         </w:tc>
@@ -2299,6 +2179,7 @@
               <w:keepNext/>
               <w:keepLines/>
               <w:spacing w:before="30" w:after="30" w:line="240" w:lineRule="auto"/>
+              <w:ind w:firstLine="0"/>
               <w:jc w:val="right"/>
             </w:pPr>
             <w:r>
@@ -2306,7 +2187,7 @@
                 <w:sz w:val="16"/>
                 <w:szCs w:val="16"/>
               </w:rPr>
-              <w:t>0,0215</w:t>
+              <w:t xml:space="preserve">0,0215</w:t>
             </w:r>
             <w:r>
               <w:rPr>
@@ -2314,7 +2195,7 @@
                 <w:szCs w:val="16"/>
                 <w:vertAlign w:val="superscript"/>
               </w:rPr>
-              <w:t>***</w:t>
+              <w:t xml:space="preserve">***</w:t>
             </w:r>
           </w:p>
         </w:tc>
@@ -2328,6 +2209,7 @@
               <w:keepNext/>
               <w:keepLines/>
               <w:spacing w:before="30" w:after="30" w:line="240" w:lineRule="auto"/>
+              <w:ind w:firstLine="0"/>
               <w:jc w:val="right"/>
             </w:pPr>
             <w:r>
@@ -2335,7 +2217,7 @@
                 <w:sz w:val="16"/>
                 <w:szCs w:val="16"/>
               </w:rPr>
-              <w:t>0,0179</w:t>
+              <w:t xml:space="preserve">0,0179</w:t>
             </w:r>
             <w:r>
               <w:rPr>
@@ -2343,7 +2225,7 @@
                 <w:szCs w:val="16"/>
                 <w:vertAlign w:val="superscript"/>
               </w:rPr>
-              <w:t>***</w:t>
+              <w:t xml:space="preserve">***</w:t>
             </w:r>
           </w:p>
         </w:tc>
@@ -2357,6 +2239,7 @@
               <w:keepNext/>
               <w:keepLines/>
               <w:spacing w:before="30" w:after="30" w:line="240" w:lineRule="auto"/>
+              <w:ind w:firstLine="0"/>
               <w:jc w:val="right"/>
             </w:pPr>
             <w:r>
@@ -2364,7 +2247,7 @@
                 <w:sz w:val="16"/>
                 <w:szCs w:val="16"/>
               </w:rPr>
-              <w:t>0,0159</w:t>
+              <w:t xml:space="preserve">0,0159</w:t>
             </w:r>
             <w:r>
               <w:rPr>
@@ -2372,7 +2255,7 @@
                 <w:szCs w:val="16"/>
                 <w:vertAlign w:val="superscript"/>
               </w:rPr>
-              <w:t>***</w:t>
+              <w:t xml:space="preserve">***</w:t>
             </w:r>
           </w:p>
         </w:tc>
@@ -2386,6 +2269,7 @@
               <w:keepNext/>
               <w:keepLines/>
               <w:spacing w:before="30" w:after="30" w:line="240" w:lineRule="auto"/>
+              <w:ind w:firstLine="0"/>
               <w:jc w:val="right"/>
             </w:pPr>
             <w:r>
@@ -2393,7 +2277,7 @@
                 <w:sz w:val="16"/>
                 <w:szCs w:val="16"/>
               </w:rPr>
-              <w:t>0,0171</w:t>
+              <w:t xml:space="preserve">0,0171</w:t>
             </w:r>
           </w:p>
         </w:tc>
@@ -2407,23 +2291,22 @@
               <w:keepNext/>
               <w:keepLines/>
               <w:spacing w:before="30" w:after="30" w:line="240" w:lineRule="auto"/>
+              <w:ind w:firstLine="0"/>
+              <w:jc w:val="left"/>
             </w:pPr>
-            <w:proofErr w:type="spellStart"/>
-            <w:r>
-              <w:rPr>
-                <w:sz w:val="16"/>
-                <w:szCs w:val="16"/>
-              </w:rPr>
-              <w:t>estável</w:t>
-            </w:r>
-            <w:proofErr w:type="spellEnd"/>
+            <w:r>
+              <w:rPr>
+                <w:sz w:val="16"/>
+                <w:szCs w:val="16"/>
+              </w:rPr>
+              <w:t xml:space="preserve">estável</w:t>
+            </w:r>
           </w:p>
         </w:tc>
       </w:tr>
       <w:tr>
         <w:trPr>
           <w:cantSplit/>
-          <w:jc w:val="center"/>
         </w:trPr>
         <w:tc>
           <w:tcPr>
@@ -2435,32 +2318,16 @@
               <w:keepNext/>
               <w:keepLines/>
               <w:spacing w:before="30" w:after="30" w:line="240" w:lineRule="auto"/>
+              <w:ind w:firstLine="0"/>
+              <w:jc w:val="left"/>
             </w:pPr>
-            <w:proofErr w:type="spellStart"/>
-            <w:r>
-              <w:rPr>
-                <w:sz w:val="16"/>
-                <w:szCs w:val="16"/>
-              </w:rPr>
-              <w:t>Índice</w:t>
-            </w:r>
-            <w:proofErr w:type="spellEnd"/>
-            <w:r>
-              <w:rPr>
-                <w:sz w:val="16"/>
-                <w:szCs w:val="16"/>
-              </w:rPr>
-              <w:t xml:space="preserve"> de </w:t>
-            </w:r>
-            <w:proofErr w:type="spellStart"/>
-            <w:r>
-              <w:rPr>
-                <w:sz w:val="16"/>
-                <w:szCs w:val="16"/>
-              </w:rPr>
-              <w:t>eficiência</w:t>
-            </w:r>
-            <w:proofErr w:type="spellEnd"/>
+            <w:r>
+              <w:rPr>
+                <w:sz w:val="16"/>
+                <w:szCs w:val="16"/>
+              </w:rPr>
+              <w:t xml:space="preserve">Retorno sobre o ativo, antes dos tributos</w:t>
+            </w:r>
           </w:p>
         </w:tc>
         <w:tc>
@@ -2473,6 +2340,7 @@
               <w:keepNext/>
               <w:keepLines/>
               <w:spacing w:before="30" w:after="30" w:line="240" w:lineRule="auto"/>
+              <w:ind w:firstLine="0"/>
               <w:jc w:val="right"/>
             </w:pPr>
             <w:r>
@@ -2480,7 +2348,7 @@
                 <w:sz w:val="16"/>
                 <w:szCs w:val="16"/>
               </w:rPr>
-              <w:t>−0,6025</w:t>
+              <w:t xml:space="preserve">0,0118</w:t>
             </w:r>
             <w:r>
               <w:rPr>
@@ -2488,7 +2356,7 @@
                 <w:szCs w:val="16"/>
                 <w:vertAlign w:val="superscript"/>
               </w:rPr>
-              <w:t>***</w:t>
+              <w:t xml:space="preserve">***</w:t>
             </w:r>
           </w:p>
         </w:tc>
@@ -2502,6 +2370,7 @@
               <w:keepNext/>
               <w:keepLines/>
               <w:spacing w:before="30" w:after="30" w:line="240" w:lineRule="auto"/>
+              <w:ind w:firstLine="0"/>
               <w:jc w:val="right"/>
             </w:pPr>
             <w:r>
@@ -2509,7 +2378,7 @@
                 <w:sz w:val="16"/>
                 <w:szCs w:val="16"/>
               </w:rPr>
-              <w:t>−0,7923</w:t>
+              <w:t xml:space="preserve">0,0132</w:t>
             </w:r>
             <w:r>
               <w:rPr>
@@ -2517,7 +2386,7 @@
                 <w:szCs w:val="16"/>
                 <w:vertAlign w:val="superscript"/>
               </w:rPr>
-              <w:t>***</w:t>
+              <w:t xml:space="preserve">**</w:t>
             </w:r>
           </w:p>
         </w:tc>
@@ -2531,6 +2400,7 @@
               <w:keepNext/>
               <w:keepLines/>
               <w:spacing w:before="30" w:after="30" w:line="240" w:lineRule="auto"/>
+              <w:ind w:firstLine="0"/>
               <w:jc w:val="right"/>
             </w:pPr>
             <w:r>
@@ -2538,15 +2408,7 @@
                 <w:sz w:val="16"/>
                 <w:szCs w:val="16"/>
               </w:rPr>
-              <w:t>−0,8385</w:t>
-            </w:r>
-            <w:r>
-              <w:rPr>
-                <w:sz w:val="16"/>
-                <w:szCs w:val="16"/>
-                <w:vertAlign w:val="superscript"/>
-              </w:rPr>
-              <w:t>***</w:t>
+              <w:t xml:space="preserve">0,0088</w:t>
             </w:r>
           </w:p>
         </w:tc>
@@ -2560,6 +2422,7 @@
               <w:keepNext/>
               <w:keepLines/>
               <w:spacing w:before="30" w:after="30" w:line="240" w:lineRule="auto"/>
+              <w:ind w:firstLine="0"/>
               <w:jc w:val="right"/>
             </w:pPr>
             <w:r>
@@ -2567,15 +2430,7 @@
                 <w:sz w:val="16"/>
                 <w:szCs w:val="16"/>
               </w:rPr>
-              <w:t>−0,7522</w:t>
-            </w:r>
-            <w:r>
-              <w:rPr>
-                <w:sz w:val="16"/>
-                <w:szCs w:val="16"/>
-                <w:vertAlign w:val="superscript"/>
-              </w:rPr>
-              <w:t>***</w:t>
+              <w:t xml:space="preserve">0,0062</w:t>
             </w:r>
           </w:p>
         </w:tc>
@@ -2589,6 +2444,7 @@
               <w:keepNext/>
               <w:keepLines/>
               <w:spacing w:before="30" w:after="30" w:line="240" w:lineRule="auto"/>
+              <w:ind w:firstLine="0"/>
               <w:jc w:val="right"/>
             </w:pPr>
             <w:r>
@@ -2596,7 +2452,7 @@
                 <w:sz w:val="16"/>
                 <w:szCs w:val="16"/>
               </w:rPr>
-              <w:t>−0,1796</w:t>
+              <w:t xml:space="preserve">0,0144</w:t>
             </w:r>
           </w:p>
         </w:tc>
@@ -2610,39 +2466,22 @@
               <w:keepNext/>
               <w:keepLines/>
               <w:spacing w:before="30" w:after="30" w:line="240" w:lineRule="auto"/>
+              <w:ind w:firstLine="0"/>
+              <w:jc w:val="left"/>
             </w:pPr>
-            <w:proofErr w:type="spellStart"/>
-            <w:r>
-              <w:rPr>
-                <w:sz w:val="16"/>
-                <w:szCs w:val="16"/>
-              </w:rPr>
-              <w:t>estável</w:t>
-            </w:r>
-            <w:proofErr w:type="spellEnd"/>
-            <w:r>
-              <w:rPr>
-                <w:sz w:val="16"/>
-                <w:szCs w:val="16"/>
-              </w:rPr>
-              <w:t xml:space="preserve"> no </w:t>
-            </w:r>
-            <w:proofErr w:type="spellStart"/>
-            <w:r>
-              <w:rPr>
-                <w:sz w:val="16"/>
-                <w:szCs w:val="16"/>
-              </w:rPr>
-              <w:t>sinal</w:t>
-            </w:r>
-            <w:proofErr w:type="spellEnd"/>
+            <w:r>
+              <w:rPr>
+                <w:sz w:val="16"/>
+                <w:szCs w:val="16"/>
+              </w:rPr>
+              <w:t xml:space="preserve">nulo</w:t>
+            </w:r>
           </w:p>
         </w:tc>
       </w:tr>
       <w:tr>
         <w:trPr>
           <w:cantSplit/>
-          <w:jc w:val="center"/>
         </w:trPr>
         <w:tc>
           <w:tcPr>
@@ -2654,48 +2493,16 @@
               <w:keepNext/>
               <w:keepLines/>
               <w:spacing w:before="30" w:after="30" w:line="240" w:lineRule="auto"/>
+              <w:ind w:firstLine="0"/>
+              <w:jc w:val="left"/>
             </w:pPr>
-            <w:proofErr w:type="spellStart"/>
-            <w:r>
-              <w:rPr>
-                <w:sz w:val="16"/>
-                <w:szCs w:val="16"/>
-              </w:rPr>
-              <w:t>Operações</w:t>
-            </w:r>
-            <w:proofErr w:type="spellEnd"/>
-            <w:r>
-              <w:rPr>
-                <w:sz w:val="16"/>
-                <w:szCs w:val="16"/>
-              </w:rPr>
-              <w:t xml:space="preserve"> de </w:t>
-            </w:r>
-            <w:proofErr w:type="spellStart"/>
-            <w:r>
-              <w:rPr>
-                <w:sz w:val="16"/>
-                <w:szCs w:val="16"/>
-              </w:rPr>
-              <w:t>crédito</w:t>
-            </w:r>
-            <w:proofErr w:type="spellEnd"/>
-            <w:r>
-              <w:rPr>
-                <w:sz w:val="16"/>
-                <w:szCs w:val="16"/>
-              </w:rPr>
-              <w:t xml:space="preserve"> / </w:t>
-            </w:r>
-            <w:proofErr w:type="spellStart"/>
-            <w:r>
-              <w:rPr>
-                <w:sz w:val="16"/>
-                <w:szCs w:val="16"/>
-              </w:rPr>
-              <w:t>ativo</w:t>
-            </w:r>
-            <w:proofErr w:type="spellEnd"/>
+            <w:r>
+              <w:rPr>
+                <w:sz w:val="16"/>
+                <w:szCs w:val="16"/>
+              </w:rPr>
+              <w:t xml:space="preserve">Índice de eficiência</w:t>
+            </w:r>
           </w:p>
         </w:tc>
         <w:tc>
@@ -2708,6 +2515,7 @@
               <w:keepNext/>
               <w:keepLines/>
               <w:spacing w:before="30" w:after="30" w:line="240" w:lineRule="auto"/>
+              <w:ind w:firstLine="0"/>
               <w:jc w:val="right"/>
             </w:pPr>
             <w:r>
@@ -2715,7 +2523,7 @@
                 <w:sz w:val="16"/>
                 <w:szCs w:val="16"/>
               </w:rPr>
-              <w:t>0,1654</w:t>
+              <w:t xml:space="preserve">−0,6025</w:t>
             </w:r>
             <w:r>
               <w:rPr>
@@ -2723,7 +2531,7 @@
                 <w:szCs w:val="16"/>
                 <w:vertAlign w:val="superscript"/>
               </w:rPr>
-              <w:t>***</w:t>
+              <w:t xml:space="preserve">***</w:t>
             </w:r>
           </w:p>
         </w:tc>
@@ -2737,6 +2545,7 @@
               <w:keepNext/>
               <w:keepLines/>
               <w:spacing w:before="30" w:after="30" w:line="240" w:lineRule="auto"/>
+              <w:ind w:firstLine="0"/>
               <w:jc w:val="right"/>
             </w:pPr>
             <w:r>
@@ -2744,7 +2553,7 @@
                 <w:sz w:val="16"/>
                 <w:szCs w:val="16"/>
               </w:rPr>
-              <w:t>0,1881</w:t>
+              <w:t xml:space="preserve">−0,7923</w:t>
             </w:r>
             <w:r>
               <w:rPr>
@@ -2752,7 +2561,7 @@
                 <w:szCs w:val="16"/>
                 <w:vertAlign w:val="superscript"/>
               </w:rPr>
-              <w:t>***</w:t>
+              <w:t xml:space="preserve">***</w:t>
             </w:r>
           </w:p>
         </w:tc>
@@ -2766,6 +2575,7 @@
               <w:keepNext/>
               <w:keepLines/>
               <w:spacing w:before="30" w:after="30" w:line="240" w:lineRule="auto"/>
+              <w:ind w:firstLine="0"/>
               <w:jc w:val="right"/>
             </w:pPr>
             <w:r>
@@ -2773,7 +2583,7 @@
                 <w:sz w:val="16"/>
                 <w:szCs w:val="16"/>
               </w:rPr>
-              <w:t>0,1701</w:t>
+              <w:t xml:space="preserve">−0,8385</w:t>
             </w:r>
             <w:r>
               <w:rPr>
@@ -2781,7 +2591,7 @@
                 <w:szCs w:val="16"/>
                 <w:vertAlign w:val="superscript"/>
               </w:rPr>
-              <w:t>***</w:t>
+              <w:t xml:space="preserve">***</w:t>
             </w:r>
           </w:p>
         </w:tc>
@@ -2795,6 +2605,7 @@
               <w:keepNext/>
               <w:keepLines/>
               <w:spacing w:before="30" w:after="30" w:line="240" w:lineRule="auto"/>
+              <w:ind w:firstLine="0"/>
               <w:jc w:val="right"/>
             </w:pPr>
             <w:r>
@@ -2802,7 +2613,7 @@
                 <w:sz w:val="16"/>
                 <w:szCs w:val="16"/>
               </w:rPr>
-              <w:t>0,1780</w:t>
+              <w:t xml:space="preserve">−0,7522</w:t>
             </w:r>
             <w:r>
               <w:rPr>
@@ -2810,7 +2621,7 @@
                 <w:szCs w:val="16"/>
                 <w:vertAlign w:val="superscript"/>
               </w:rPr>
-              <w:t>***</w:t>
+              <w:t xml:space="preserve">***</w:t>
             </w:r>
           </w:p>
         </w:tc>
@@ -2824,6 +2635,7 @@
               <w:keepNext/>
               <w:keepLines/>
               <w:spacing w:before="30" w:after="30" w:line="240" w:lineRule="auto"/>
+              <w:ind w:firstLine="0"/>
               <w:jc w:val="right"/>
             </w:pPr>
             <w:r>
@@ -2831,7 +2643,7 @@
                 <w:sz w:val="16"/>
                 <w:szCs w:val="16"/>
               </w:rPr>
-              <w:t>0,2448</w:t>
+              <w:t xml:space="preserve">−0,1796</w:t>
             </w:r>
           </w:p>
         </w:tc>
@@ -2845,23 +2657,22 @@
               <w:keepNext/>
               <w:keepLines/>
               <w:spacing w:before="30" w:after="30" w:line="240" w:lineRule="auto"/>
+              <w:ind w:firstLine="0"/>
+              <w:jc w:val="left"/>
             </w:pPr>
-            <w:proofErr w:type="spellStart"/>
-            <w:r>
-              <w:rPr>
-                <w:sz w:val="16"/>
-                <w:szCs w:val="16"/>
-              </w:rPr>
-              <w:t>estável</w:t>
-            </w:r>
-            <w:proofErr w:type="spellEnd"/>
+            <w:r>
+              <w:rPr>
+                <w:sz w:val="16"/>
+                <w:szCs w:val="16"/>
+              </w:rPr>
+              <w:t xml:space="preserve">estável no sinal</w:t>
+            </w:r>
           </w:p>
         </w:tc>
       </w:tr>
       <w:tr>
         <w:trPr>
           <w:cantSplit/>
-          <w:jc w:val="center"/>
         </w:trPr>
         <w:tc>
           <w:tcPr>
@@ -2873,32 +2684,16 @@
               <w:keepNext/>
               <w:keepLines/>
               <w:spacing w:before="30" w:after="30" w:line="240" w:lineRule="auto"/>
+              <w:ind w:firstLine="0"/>
+              <w:jc w:val="left"/>
             </w:pPr>
-            <w:proofErr w:type="spellStart"/>
-            <w:r>
-              <w:rPr>
-                <w:sz w:val="16"/>
-                <w:szCs w:val="16"/>
-              </w:rPr>
-              <w:t>Provisão</w:t>
-            </w:r>
-            <w:proofErr w:type="spellEnd"/>
-            <w:r>
-              <w:rPr>
-                <w:sz w:val="16"/>
-                <w:szCs w:val="16"/>
-              </w:rPr>
-              <w:t xml:space="preserve"> / </w:t>
-            </w:r>
-            <w:proofErr w:type="spellStart"/>
-            <w:r>
-              <w:rPr>
-                <w:sz w:val="16"/>
-                <w:szCs w:val="16"/>
-              </w:rPr>
-              <w:t>carteira</w:t>
-            </w:r>
-            <w:proofErr w:type="spellEnd"/>
+            <w:r>
+              <w:rPr>
+                <w:sz w:val="16"/>
+                <w:szCs w:val="16"/>
+              </w:rPr>
+              <w:t xml:space="preserve">Operações de crédito / ativo</w:t>
+            </w:r>
           </w:p>
         </w:tc>
         <w:tc>
@@ -2911,6 +2706,7 @@
               <w:keepNext/>
               <w:keepLines/>
               <w:spacing w:before="30" w:after="30" w:line="240" w:lineRule="auto"/>
+              <w:ind w:firstLine="0"/>
               <w:jc w:val="right"/>
             </w:pPr>
             <w:r>
@@ -2918,7 +2714,15 @@
                 <w:sz w:val="16"/>
                 <w:szCs w:val="16"/>
               </w:rPr>
-              <w:t>0,0020</w:t>
+              <w:t xml:space="preserve">0,1654</w:t>
+            </w:r>
+            <w:r>
+              <w:rPr>
+                <w:sz w:val="16"/>
+                <w:szCs w:val="16"/>
+                <w:vertAlign w:val="superscript"/>
+              </w:rPr>
+              <w:t xml:space="preserve">***</w:t>
             </w:r>
           </w:p>
         </w:tc>
@@ -2932,6 +2736,7 @@
               <w:keepNext/>
               <w:keepLines/>
               <w:spacing w:before="30" w:after="30" w:line="240" w:lineRule="auto"/>
+              <w:ind w:firstLine="0"/>
               <w:jc w:val="right"/>
             </w:pPr>
             <w:r>
@@ -2939,7 +2744,15 @@
                 <w:sz w:val="16"/>
                 <w:szCs w:val="16"/>
               </w:rPr>
-              <w:t>−0,0012</w:t>
+              <w:t xml:space="preserve">0,1881</w:t>
+            </w:r>
+            <w:r>
+              <w:rPr>
+                <w:sz w:val="16"/>
+                <w:szCs w:val="16"/>
+                <w:vertAlign w:val="superscript"/>
+              </w:rPr>
+              <w:t xml:space="preserve">***</w:t>
             </w:r>
           </w:p>
         </w:tc>
@@ -2953,6 +2766,7 @@
               <w:keepNext/>
               <w:keepLines/>
               <w:spacing w:before="30" w:after="30" w:line="240" w:lineRule="auto"/>
+              <w:ind w:firstLine="0"/>
               <w:jc w:val="right"/>
             </w:pPr>
             <w:r>
@@ -2960,7 +2774,15 @@
                 <w:sz w:val="16"/>
                 <w:szCs w:val="16"/>
               </w:rPr>
-              <w:t>0,0010</w:t>
+              <w:t xml:space="preserve">0,1701</w:t>
+            </w:r>
+            <w:r>
+              <w:rPr>
+                <w:sz w:val="16"/>
+                <w:szCs w:val="16"/>
+                <w:vertAlign w:val="superscript"/>
+              </w:rPr>
+              <w:t xml:space="preserve">***</w:t>
             </w:r>
           </w:p>
         </w:tc>
@@ -2974,6 +2796,7 @@
               <w:keepNext/>
               <w:keepLines/>
               <w:spacing w:before="30" w:after="30" w:line="240" w:lineRule="auto"/>
+              <w:ind w:firstLine="0"/>
               <w:jc w:val="right"/>
             </w:pPr>
             <w:r>
@@ -2981,7 +2804,15 @@
                 <w:sz w:val="16"/>
                 <w:szCs w:val="16"/>
               </w:rPr>
-              <w:t>0,0009</w:t>
+              <w:t xml:space="preserve">0,1780</w:t>
+            </w:r>
+            <w:r>
+              <w:rPr>
+                <w:sz w:val="16"/>
+                <w:szCs w:val="16"/>
+                <w:vertAlign w:val="superscript"/>
+              </w:rPr>
+              <w:t xml:space="preserve">***</w:t>
             </w:r>
           </w:p>
         </w:tc>
@@ -2995,6 +2826,7 @@
               <w:keepNext/>
               <w:keepLines/>
               <w:spacing w:before="30" w:after="30" w:line="240" w:lineRule="auto"/>
+              <w:ind w:firstLine="0"/>
               <w:jc w:val="right"/>
             </w:pPr>
             <w:r>
@@ -3002,7 +2834,7 @@
                 <w:sz w:val="16"/>
                 <w:szCs w:val="16"/>
               </w:rPr>
-              <w:t>0,0236</w:t>
+              <w:t xml:space="preserve">0,2448</w:t>
             </w:r>
           </w:p>
         </w:tc>
@@ -3016,23 +2848,22 @@
               <w:keepNext/>
               <w:keepLines/>
               <w:spacing w:before="30" w:after="30" w:line="240" w:lineRule="auto"/>
+              <w:ind w:firstLine="0"/>
+              <w:jc w:val="left"/>
             </w:pPr>
-            <w:proofErr w:type="spellStart"/>
-            <w:r>
-              <w:rPr>
-                <w:sz w:val="16"/>
-                <w:szCs w:val="16"/>
-              </w:rPr>
-              <w:t>nulo</w:t>
-            </w:r>
-            <w:proofErr w:type="spellEnd"/>
+            <w:r>
+              <w:rPr>
+                <w:sz w:val="16"/>
+                <w:szCs w:val="16"/>
+              </w:rPr>
+              <w:t xml:space="preserve">estável</w:t>
+            </w:r>
           </w:p>
         </w:tc>
       </w:tr>
       <w:tr>
         <w:trPr>
           <w:cantSplit/>
-          <w:jc w:val="center"/>
         </w:trPr>
         <w:tc>
           <w:tcPr>
@@ -3044,32 +2875,16 @@
               <w:keepNext/>
               <w:keepLines/>
               <w:spacing w:before="30" w:after="30" w:line="240" w:lineRule="auto"/>
+              <w:ind w:firstLine="0"/>
+              <w:jc w:val="left"/>
             </w:pPr>
-            <w:proofErr w:type="spellStart"/>
-            <w:r>
-              <w:rPr>
-                <w:sz w:val="16"/>
-                <w:szCs w:val="16"/>
-              </w:rPr>
-              <w:t>Margem</w:t>
-            </w:r>
-            <w:proofErr w:type="spellEnd"/>
-            <w:r>
-              <w:rPr>
-                <w:sz w:val="16"/>
-                <w:szCs w:val="16"/>
-              </w:rPr>
-              <w:t xml:space="preserve"> de </w:t>
-            </w:r>
-            <w:proofErr w:type="spellStart"/>
-            <w:r>
-              <w:rPr>
-                <w:sz w:val="16"/>
-                <w:szCs w:val="16"/>
-              </w:rPr>
-              <w:t>intermediação</w:t>
-            </w:r>
-            <w:proofErr w:type="spellEnd"/>
+            <w:r>
+              <w:rPr>
+                <w:sz w:val="16"/>
+                <w:szCs w:val="16"/>
+              </w:rPr>
+              <w:t xml:space="preserve">Provisão / carteira</w:t>
+            </w:r>
           </w:p>
         </w:tc>
         <w:tc>
@@ -3082,6 +2897,7 @@
               <w:keepNext/>
               <w:keepLines/>
               <w:spacing w:before="30" w:after="30" w:line="240" w:lineRule="auto"/>
+              <w:ind w:firstLine="0"/>
               <w:jc w:val="right"/>
             </w:pPr>
             <w:r>
@@ -3089,7 +2905,7 @@
                 <w:sz w:val="16"/>
                 <w:szCs w:val="16"/>
               </w:rPr>
-              <w:t>−0,0003</w:t>
+              <w:t xml:space="preserve">0,0020</w:t>
             </w:r>
           </w:p>
         </w:tc>
@@ -3103,6 +2919,7 @@
               <w:keepNext/>
               <w:keepLines/>
               <w:spacing w:before="30" w:after="30" w:line="240" w:lineRule="auto"/>
+              <w:ind w:firstLine="0"/>
               <w:jc w:val="right"/>
             </w:pPr>
             <w:r>
@@ -3110,7 +2927,7 @@
                 <w:sz w:val="16"/>
                 <w:szCs w:val="16"/>
               </w:rPr>
-              <w:t>−0,0190</w:t>
+              <w:t xml:space="preserve">−0,0012</w:t>
             </w:r>
           </w:p>
         </w:tc>
@@ -3124,6 +2941,7 @@
               <w:keepNext/>
               <w:keepLines/>
               <w:spacing w:before="30" w:after="30" w:line="240" w:lineRule="auto"/>
+              <w:ind w:firstLine="0"/>
               <w:jc w:val="right"/>
             </w:pPr>
             <w:r>
@@ -3131,7 +2949,7 @@
                 <w:sz w:val="16"/>
                 <w:szCs w:val="16"/>
               </w:rPr>
-              <w:t>−0,0107</w:t>
+              <w:t xml:space="preserve">0,0010</w:t>
             </w:r>
           </w:p>
         </w:tc>
@@ -3145,6 +2963,7 @@
               <w:keepNext/>
               <w:keepLines/>
               <w:spacing w:before="30" w:after="30" w:line="240" w:lineRule="auto"/>
+              <w:ind w:firstLine="0"/>
               <w:jc w:val="right"/>
             </w:pPr>
             <w:r>
@@ -3152,7 +2971,7 @@
                 <w:sz w:val="16"/>
                 <w:szCs w:val="16"/>
               </w:rPr>
-              <w:t>−0,0171</w:t>
+              <w:t xml:space="preserve">0,0009</w:t>
             </w:r>
           </w:p>
         </w:tc>
@@ -3166,6 +2985,7 @@
               <w:keepNext/>
               <w:keepLines/>
               <w:spacing w:before="30" w:after="30" w:line="240" w:lineRule="auto"/>
+              <w:ind w:firstLine="0"/>
               <w:jc w:val="right"/>
             </w:pPr>
             <w:r>
@@ -3173,7 +2993,7 @@
                 <w:sz w:val="16"/>
                 <w:szCs w:val="16"/>
               </w:rPr>
-              <w:t>0,0203</w:t>
+              <w:t xml:space="preserve">0,0236</w:t>
             </w:r>
           </w:p>
         </w:tc>
@@ -3187,223 +3007,22 @@
               <w:keepNext/>
               <w:keepLines/>
               <w:spacing w:before="30" w:after="30" w:line="240" w:lineRule="auto"/>
+              <w:ind w:firstLine="0"/>
+              <w:jc w:val="left"/>
             </w:pPr>
-            <w:proofErr w:type="spellStart"/>
-            <w:r>
-              <w:rPr>
-                <w:sz w:val="16"/>
-                <w:szCs w:val="16"/>
-              </w:rPr>
-              <w:t>nulo</w:t>
-            </w:r>
-            <w:proofErr w:type="spellEnd"/>
+            <w:r>
+              <w:rPr>
+                <w:sz w:val="16"/>
+                <w:szCs w:val="16"/>
+              </w:rPr>
+              <w:t xml:space="preserve">nulo</w:t>
+            </w:r>
           </w:p>
         </w:tc>
       </w:tr>
       <w:tr>
         <w:trPr>
           <w:cantSplit/>
-          <w:jc w:val="center"/>
-        </w:trPr>
-        <w:tc>
-          <w:tcPr>
-            <w:tcW w:w="1750" w:type="dxa"/>
-            <w:tcBorders>
-              <w:bottom w:val="single" w:color="003974" w:sz="8" w:space="0"/>
-            </w:tcBorders>
-            <w:vAlign w:val="center"/>
-          </w:tcPr>
-          <w:p>
-            <w:pPr>
-              <w:keepNext/>
-              <w:keepLines/>
-              <w:spacing w:before="30" w:after="30" w:line="240" w:lineRule="auto"/>
-            </w:pPr>
-            <w:proofErr w:type="spellStart"/>
-            <w:r>
-              <w:rPr>
-                <w:sz w:val="16"/>
-                <w:szCs w:val="16"/>
-              </w:rPr>
-              <w:t>Captações</w:t>
-            </w:r>
-            <w:proofErr w:type="spellEnd"/>
-            <w:r>
-              <w:rPr>
-                <w:sz w:val="16"/>
-                <w:szCs w:val="16"/>
-              </w:rPr>
-              <w:t xml:space="preserve"> / </w:t>
-            </w:r>
-            <w:proofErr w:type="spellStart"/>
-            <w:r>
-              <w:rPr>
-                <w:sz w:val="16"/>
-                <w:szCs w:val="16"/>
-              </w:rPr>
-              <w:t>ativo</w:t>
-            </w:r>
-            <w:proofErr w:type="spellEnd"/>
-          </w:p>
-        </w:tc>
-        <w:tc>
-          <w:tcPr>
-            <w:tcW w:w="1200" w:type="dxa"/>
-            <w:tcBorders>
-              <w:bottom w:val="single" w:color="003974" w:sz="8" w:space="0"/>
-            </w:tcBorders>
-            <w:vAlign w:val="center"/>
-          </w:tcPr>
-          <w:p>
-            <w:pPr>
-              <w:keepNext/>
-              <w:keepLines/>
-              <w:spacing w:before="30" w:after="30" w:line="240" w:lineRule="auto"/>
-              <w:jc w:val="right"/>
-            </w:pPr>
-            <w:r>
-              <w:rPr>
-                <w:sz w:val="16"/>
-                <w:szCs w:val="16"/>
-              </w:rPr>
-              <w:t>0,0461</w:t>
-            </w:r>
-          </w:p>
-        </w:tc>
-        <w:tc>
-          <w:tcPr>
-            <w:tcW w:w="1200" w:type="dxa"/>
-            <w:tcBorders>
-              <w:bottom w:val="single" w:color="003974" w:sz="8" w:space="0"/>
-            </w:tcBorders>
-            <w:vAlign w:val="center"/>
-          </w:tcPr>
-          <w:p>
-            <w:pPr>
-              <w:keepNext/>
-              <w:keepLines/>
-              <w:spacing w:before="30" w:after="30" w:line="240" w:lineRule="auto"/>
-              <w:jc w:val="right"/>
-            </w:pPr>
-            <w:r>
-              <w:rPr>
-                <w:sz w:val="16"/>
-                <w:szCs w:val="16"/>
-              </w:rPr>
-              <w:t>0,0887</w:t>
-            </w:r>
-            <w:r>
-              <w:rPr>
-                <w:sz w:val="16"/>
-                <w:szCs w:val="16"/>
-                <w:vertAlign w:val="superscript"/>
-              </w:rPr>
-              <w:t>**</w:t>
-            </w:r>
-          </w:p>
-        </w:tc>
-        <w:tc>
-          <w:tcPr>
-            <w:tcW w:w="1200" w:type="dxa"/>
-            <w:tcBorders>
-              <w:bottom w:val="single" w:color="003974" w:sz="8" w:space="0"/>
-            </w:tcBorders>
-            <w:vAlign w:val="center"/>
-          </w:tcPr>
-          <w:p>
-            <w:pPr>
-              <w:keepNext/>
-              <w:keepLines/>
-              <w:spacing w:before="30" w:after="30" w:line="240" w:lineRule="auto"/>
-              <w:jc w:val="right"/>
-            </w:pPr>
-            <w:r>
-              <w:rPr>
-                <w:sz w:val="16"/>
-                <w:szCs w:val="16"/>
-              </w:rPr>
-              <w:t>0,0536</w:t>
-            </w:r>
-          </w:p>
-        </w:tc>
-        <w:tc>
-          <w:tcPr>
-            <w:tcW w:w="1200" w:type="dxa"/>
-            <w:tcBorders>
-              <w:bottom w:val="single" w:color="003974" w:sz="8" w:space="0"/>
-            </w:tcBorders>
-            <w:vAlign w:val="center"/>
-          </w:tcPr>
-          <w:p>
-            <w:pPr>
-              <w:keepNext/>
-              <w:keepLines/>
-              <w:spacing w:before="30" w:after="30" w:line="240" w:lineRule="auto"/>
-              <w:jc w:val="right"/>
-            </w:pPr>
-            <w:r>
-              <w:rPr>
-                <w:sz w:val="16"/>
-                <w:szCs w:val="16"/>
-              </w:rPr>
-              <w:t>0,0330</w:t>
-            </w:r>
-          </w:p>
-        </w:tc>
-        <w:tc>
-          <w:tcPr>
-            <w:tcW w:w="1000" w:type="dxa"/>
-            <w:tcBorders>
-              <w:bottom w:val="single" w:color="003974" w:sz="8" w:space="0"/>
-            </w:tcBorders>
-            <w:vAlign w:val="center"/>
-          </w:tcPr>
-          <w:p>
-            <w:pPr>
-              <w:keepNext/>
-              <w:keepLines/>
-              <w:spacing w:before="30" w:after="30" w:line="240" w:lineRule="auto"/>
-              <w:jc w:val="right"/>
-            </w:pPr>
-            <w:r>
-              <w:rPr>
-                <w:sz w:val="16"/>
-                <w:szCs w:val="16"/>
-              </w:rPr>
-              <w:t>−0,0247</w:t>
-            </w:r>
-          </w:p>
-        </w:tc>
-        <w:tc>
-          <w:tcPr>
-            <w:tcW w:w="2088" w:type="dxa"/>
-            <w:tcBorders>
-              <w:bottom w:val="single" w:color="003974" w:sz="8" w:space="0"/>
-            </w:tcBorders>
-            <w:vAlign w:val="center"/>
-          </w:tcPr>
-          <w:p>
-            <w:pPr>
-              <w:keepNext/>
-              <w:keepLines/>
-              <w:spacing w:before="30" w:after="30" w:line="240" w:lineRule="auto"/>
-            </w:pPr>
-            <w:proofErr w:type="spellStart"/>
-            <w:r>
-              <w:rPr>
-                <w:sz w:val="16"/>
-                <w:szCs w:val="16"/>
-              </w:rPr>
-              <w:t>nulo</w:t>
-            </w:r>
-            <w:proofErr w:type="spellEnd"/>
-          </w:p>
-        </w:tc>
-      </w:tr>
-      <w:tr>
-        <w:trPr>
-          <w:cantSplit/>
-          <w:jc w:val="center"/>
         </w:trPr>
         <w:tc>
           <w:tcPr>
@@ -3415,22 +3034,15 @@
               <w:keepNext/>
               <w:keepLines/>
               <w:spacing w:before="30" w:after="30" w:line="240" w:lineRule="auto"/>
+              <w:ind w:firstLine="0"/>
+              <w:jc w:val="left"/>
             </w:pPr>
-            <w:proofErr w:type="spellStart"/>
-            <w:r>
-              <w:rPr>
-                <w:sz w:val="16"/>
-                <w:szCs w:val="16"/>
-              </w:rPr>
-              <w:t>Volatilidade</w:t>
-            </w:r>
-            <w:proofErr w:type="spellEnd"/>
-            <w:r>
-              <w:rPr>
-                <w:sz w:val="16"/>
-                <w:szCs w:val="16"/>
-              </w:rPr>
-              <w:t xml:space="preserve"> do ROA</w:t>
+            <w:r>
+              <w:rPr>
+                <w:sz w:val="16"/>
+                <w:szCs w:val="16"/>
+              </w:rPr>
+              <w:t xml:space="preserve">Margem de intermediação</w:t>
             </w:r>
           </w:p>
         </w:tc>
@@ -3444,6 +3056,7 @@
               <w:keepNext/>
               <w:keepLines/>
               <w:spacing w:before="30" w:after="30" w:line="240" w:lineRule="auto"/>
+              <w:ind w:firstLine="0"/>
               <w:jc w:val="right"/>
             </w:pPr>
             <w:r>
@@ -3451,15 +3064,7 @@
                 <w:sz w:val="16"/>
                 <w:szCs w:val="16"/>
               </w:rPr>
-              <w:t>−0,0110</w:t>
-            </w:r>
-            <w:r>
-              <w:rPr>
-                <w:sz w:val="16"/>
-                <w:szCs w:val="16"/>
-                <w:vertAlign w:val="superscript"/>
-              </w:rPr>
-              <w:t>***</w:t>
+              <w:t xml:space="preserve">−0,0003</w:t>
             </w:r>
           </w:p>
         </w:tc>
@@ -3473,6 +3078,7 @@
               <w:keepNext/>
               <w:keepLines/>
               <w:spacing w:before="30" w:after="30" w:line="240" w:lineRule="auto"/>
+              <w:ind w:firstLine="0"/>
               <w:jc w:val="right"/>
             </w:pPr>
             <w:r>
@@ -3480,15 +3086,7 @@
                 <w:sz w:val="16"/>
                 <w:szCs w:val="16"/>
               </w:rPr>
-              <w:t>−0,0189</w:t>
-            </w:r>
-            <w:r>
-              <w:rPr>
-                <w:sz w:val="16"/>
-                <w:szCs w:val="16"/>
-                <w:vertAlign w:val="superscript"/>
-              </w:rPr>
-              <w:t>***</w:t>
+              <w:t xml:space="preserve">−0,0190</w:t>
             </w:r>
           </w:p>
         </w:tc>
@@ -3502,6 +3100,7 @@
               <w:keepNext/>
               <w:keepLines/>
               <w:spacing w:before="30" w:after="30" w:line="240" w:lineRule="auto"/>
+              <w:ind w:firstLine="0"/>
               <w:jc w:val="right"/>
             </w:pPr>
             <w:r>
@@ -3509,15 +3108,7 @@
                 <w:sz w:val="16"/>
                 <w:szCs w:val="16"/>
               </w:rPr>
-              <w:t>−0,0175</w:t>
-            </w:r>
-            <w:r>
-              <w:rPr>
-                <w:sz w:val="16"/>
-                <w:szCs w:val="16"/>
-                <w:vertAlign w:val="superscript"/>
-              </w:rPr>
-              <w:t>***</w:t>
+              <w:t xml:space="preserve">−0,0107</w:t>
             </w:r>
           </w:p>
         </w:tc>
@@ -3531,6 +3122,7 @@
               <w:keepNext/>
               <w:keepLines/>
               <w:spacing w:before="30" w:after="30" w:line="240" w:lineRule="auto"/>
+              <w:ind w:firstLine="0"/>
               <w:jc w:val="right"/>
             </w:pPr>
             <w:r>
@@ -3538,15 +3130,7 @@
                 <w:sz w:val="16"/>
                 <w:szCs w:val="16"/>
               </w:rPr>
-              <w:t>−0,0170</w:t>
-            </w:r>
-            <w:r>
-              <w:rPr>
-                <w:sz w:val="16"/>
-                <w:szCs w:val="16"/>
-                <w:vertAlign w:val="superscript"/>
-              </w:rPr>
-              <w:t>***</w:t>
+              <w:t xml:space="preserve">−0,0171</w:t>
             </w:r>
           </w:p>
         </w:tc>
@@ -3560,6 +3144,7 @@
               <w:keepNext/>
               <w:keepLines/>
               <w:spacing w:before="30" w:after="30" w:line="240" w:lineRule="auto"/>
+              <w:ind w:firstLine="0"/>
               <w:jc w:val="right"/>
             </w:pPr>
             <w:r>
@@ -3567,7 +3152,7 @@
                 <w:sz w:val="16"/>
                 <w:szCs w:val="16"/>
               </w:rPr>
-              <w:t>−0,0133</w:t>
+              <w:t xml:space="preserve">0,0203</w:t>
             </w:r>
           </w:p>
         </w:tc>
@@ -3581,23 +3166,401 @@
               <w:keepNext/>
               <w:keepLines/>
               <w:spacing w:before="30" w:after="30" w:line="240" w:lineRule="auto"/>
+              <w:ind w:firstLine="0"/>
+              <w:jc w:val="left"/>
             </w:pPr>
-            <w:proofErr w:type="spellStart"/>
-            <w:r>
-              <w:rPr>
-                <w:sz w:val="16"/>
-                <w:szCs w:val="16"/>
-              </w:rPr>
-              <w:t>estável</w:t>
-            </w:r>
-            <w:proofErr w:type="spellEnd"/>
+            <w:r>
+              <w:rPr>
+                <w:sz w:val="16"/>
+                <w:szCs w:val="16"/>
+              </w:rPr>
+              <w:t xml:space="preserve">nulo</w:t>
+            </w:r>
           </w:p>
         </w:tc>
       </w:tr>
       <w:tr>
         <w:trPr>
           <w:cantSplit/>
-          <w:jc w:val="center"/>
+        </w:trPr>
+        <w:tc>
+          <w:tcPr>
+            <w:tcW w:w="1750" w:type="dxa"/>
+            <w:tcBorders>
+              <w:bottom w:val="single" w:sz="8" w:space="0" w:color="003974"/>
+            </w:tcBorders>
+            <w:vAlign w:val="center"/>
+          </w:tcPr>
+          <w:p>
+            <w:pPr>
+              <w:keepNext/>
+              <w:keepLines/>
+              <w:spacing w:before="30" w:after="30" w:line="240" w:lineRule="auto"/>
+              <w:ind w:firstLine="0"/>
+              <w:jc w:val="left"/>
+            </w:pPr>
+            <w:r>
+              <w:rPr>
+                <w:sz w:val="16"/>
+                <w:szCs w:val="16"/>
+              </w:rPr>
+              <w:t xml:space="preserve">Captações / ativo</w:t>
+            </w:r>
+          </w:p>
+        </w:tc>
+        <w:tc>
+          <w:tcPr>
+            <w:tcW w:w="1200" w:type="dxa"/>
+            <w:tcBorders>
+              <w:bottom w:val="single" w:sz="8" w:space="0" w:color="003974"/>
+            </w:tcBorders>
+            <w:vAlign w:val="center"/>
+          </w:tcPr>
+          <w:p>
+            <w:pPr>
+              <w:keepNext/>
+              <w:keepLines/>
+              <w:spacing w:before="30" w:after="30" w:line="240" w:lineRule="auto"/>
+              <w:ind w:firstLine="0"/>
+              <w:jc w:val="right"/>
+            </w:pPr>
+            <w:r>
+              <w:rPr>
+                <w:sz w:val="16"/>
+                <w:szCs w:val="16"/>
+              </w:rPr>
+              <w:t xml:space="preserve">0,0461</w:t>
+            </w:r>
+          </w:p>
+        </w:tc>
+        <w:tc>
+          <w:tcPr>
+            <w:tcW w:w="1200" w:type="dxa"/>
+            <w:tcBorders>
+              <w:bottom w:val="single" w:sz="8" w:space="0" w:color="003974"/>
+            </w:tcBorders>
+            <w:vAlign w:val="center"/>
+          </w:tcPr>
+          <w:p>
+            <w:pPr>
+              <w:keepNext/>
+              <w:keepLines/>
+              <w:spacing w:before="30" w:after="30" w:line="240" w:lineRule="auto"/>
+              <w:ind w:firstLine="0"/>
+              <w:jc w:val="right"/>
+            </w:pPr>
+            <w:r>
+              <w:rPr>
+                <w:sz w:val="16"/>
+                <w:szCs w:val="16"/>
+              </w:rPr>
+              <w:t xml:space="preserve">0,0887</w:t>
+            </w:r>
+            <w:r>
+              <w:rPr>
+                <w:sz w:val="16"/>
+                <w:szCs w:val="16"/>
+                <w:vertAlign w:val="superscript"/>
+              </w:rPr>
+              <w:t xml:space="preserve">**</w:t>
+            </w:r>
+          </w:p>
+        </w:tc>
+        <w:tc>
+          <w:tcPr>
+            <w:tcW w:w="1200" w:type="dxa"/>
+            <w:tcBorders>
+              <w:bottom w:val="single" w:sz="8" w:space="0" w:color="003974"/>
+            </w:tcBorders>
+            <w:vAlign w:val="center"/>
+          </w:tcPr>
+          <w:p>
+            <w:pPr>
+              <w:keepNext/>
+              <w:keepLines/>
+              <w:spacing w:before="30" w:after="30" w:line="240" w:lineRule="auto"/>
+              <w:ind w:firstLine="0"/>
+              <w:jc w:val="right"/>
+            </w:pPr>
+            <w:r>
+              <w:rPr>
+                <w:sz w:val="16"/>
+                <w:szCs w:val="16"/>
+              </w:rPr>
+              <w:t xml:space="preserve">0,0536</w:t>
+            </w:r>
+          </w:p>
+        </w:tc>
+        <w:tc>
+          <w:tcPr>
+            <w:tcW w:w="1200" w:type="dxa"/>
+            <w:tcBorders>
+              <w:bottom w:val="single" w:sz="8" w:space="0" w:color="003974"/>
+            </w:tcBorders>
+            <w:vAlign w:val="center"/>
+          </w:tcPr>
+          <w:p>
+            <w:pPr>
+              <w:keepNext/>
+              <w:keepLines/>
+              <w:spacing w:before="30" w:after="30" w:line="240" w:lineRule="auto"/>
+              <w:ind w:firstLine="0"/>
+              <w:jc w:val="right"/>
+            </w:pPr>
+            <w:r>
+              <w:rPr>
+                <w:sz w:val="16"/>
+                <w:szCs w:val="16"/>
+              </w:rPr>
+              <w:t xml:space="preserve">0,0330</w:t>
+            </w:r>
+          </w:p>
+        </w:tc>
+        <w:tc>
+          <w:tcPr>
+            <w:tcW w:w="1000" w:type="dxa"/>
+            <w:tcBorders>
+              <w:bottom w:val="single" w:sz="8" w:space="0" w:color="003974"/>
+            </w:tcBorders>
+            <w:vAlign w:val="center"/>
+          </w:tcPr>
+          <w:p>
+            <w:pPr>
+              <w:keepNext/>
+              <w:keepLines/>
+              <w:spacing w:before="30" w:after="30" w:line="240" w:lineRule="auto"/>
+              <w:ind w:firstLine="0"/>
+              <w:jc w:val="right"/>
+            </w:pPr>
+            <w:r>
+              <w:rPr>
+                <w:sz w:val="16"/>
+                <w:szCs w:val="16"/>
+              </w:rPr>
+              <w:t xml:space="preserve">−0,0247</w:t>
+            </w:r>
+          </w:p>
+        </w:tc>
+        <w:tc>
+          <w:tcPr>
+            <w:tcW w:w="2088" w:type="dxa"/>
+            <w:tcBorders>
+              <w:bottom w:val="single" w:sz="8" w:space="0" w:color="003974"/>
+            </w:tcBorders>
+            <w:vAlign w:val="center"/>
+          </w:tcPr>
+          <w:p>
+            <w:pPr>
+              <w:keepNext/>
+              <w:keepLines/>
+              <w:spacing w:before="30" w:after="30" w:line="240" w:lineRule="auto"/>
+              <w:ind w:firstLine="0"/>
+              <w:jc w:val="left"/>
+            </w:pPr>
+            <w:r>
+              <w:rPr>
+                <w:sz w:val="16"/>
+                <w:szCs w:val="16"/>
+              </w:rPr>
+              <w:t xml:space="preserve">nulo</w:t>
+            </w:r>
+          </w:p>
+        </w:tc>
+      </w:tr>
+      <w:tr>
+        <w:trPr>
+          <w:cantSplit/>
+        </w:trPr>
+        <w:tc>
+          <w:tcPr>
+            <w:tcW w:w="1750" w:type="dxa"/>
+            <w:vAlign w:val="center"/>
+          </w:tcPr>
+          <w:p>
+            <w:pPr>
+              <w:keepNext/>
+              <w:keepLines/>
+              <w:spacing w:before="30" w:after="30" w:line="240" w:lineRule="auto"/>
+              <w:ind w:firstLine="0"/>
+              <w:jc w:val="left"/>
+            </w:pPr>
+            <w:r>
+              <w:rPr>
+                <w:sz w:val="16"/>
+                <w:szCs w:val="16"/>
+              </w:rPr>
+              <w:t xml:space="preserve">Volatilidade do ROA</w:t>
+            </w:r>
+          </w:p>
+        </w:tc>
+        <w:tc>
+          <w:tcPr>
+            <w:tcW w:w="1200" w:type="dxa"/>
+            <w:vAlign w:val="center"/>
+          </w:tcPr>
+          <w:p>
+            <w:pPr>
+              <w:keepNext/>
+              <w:keepLines/>
+              <w:spacing w:before="30" w:after="30" w:line="240" w:lineRule="auto"/>
+              <w:ind w:firstLine="0"/>
+              <w:jc w:val="right"/>
+            </w:pPr>
+            <w:r>
+              <w:rPr>
+                <w:sz w:val="16"/>
+                <w:szCs w:val="16"/>
+              </w:rPr>
+              <w:t xml:space="preserve">−0,0110</w:t>
+            </w:r>
+            <w:r>
+              <w:rPr>
+                <w:sz w:val="16"/>
+                <w:szCs w:val="16"/>
+                <w:vertAlign w:val="superscript"/>
+              </w:rPr>
+              <w:t xml:space="preserve">***</w:t>
+            </w:r>
+          </w:p>
+        </w:tc>
+        <w:tc>
+          <w:tcPr>
+            <w:tcW w:w="1200" w:type="dxa"/>
+            <w:vAlign w:val="center"/>
+          </w:tcPr>
+          <w:p>
+            <w:pPr>
+              <w:keepNext/>
+              <w:keepLines/>
+              <w:spacing w:before="30" w:after="30" w:line="240" w:lineRule="auto"/>
+              <w:ind w:firstLine="0"/>
+              <w:jc w:val="right"/>
+            </w:pPr>
+            <w:r>
+              <w:rPr>
+                <w:sz w:val="16"/>
+                <w:szCs w:val="16"/>
+              </w:rPr>
+              <w:t xml:space="preserve">−0,0189</w:t>
+            </w:r>
+            <w:r>
+              <w:rPr>
+                <w:sz w:val="16"/>
+                <w:szCs w:val="16"/>
+                <w:vertAlign w:val="superscript"/>
+              </w:rPr>
+              <w:t xml:space="preserve">***</w:t>
+            </w:r>
+          </w:p>
+        </w:tc>
+        <w:tc>
+          <w:tcPr>
+            <w:tcW w:w="1200" w:type="dxa"/>
+            <w:vAlign w:val="center"/>
+          </w:tcPr>
+          <w:p>
+            <w:pPr>
+              <w:keepNext/>
+              <w:keepLines/>
+              <w:spacing w:before="30" w:after="30" w:line="240" w:lineRule="auto"/>
+              <w:ind w:firstLine="0"/>
+              <w:jc w:val="right"/>
+            </w:pPr>
+            <w:r>
+              <w:rPr>
+                <w:sz w:val="16"/>
+                <w:szCs w:val="16"/>
+              </w:rPr>
+              <w:t xml:space="preserve">−0,0175</w:t>
+            </w:r>
+            <w:r>
+              <w:rPr>
+                <w:sz w:val="16"/>
+                <w:szCs w:val="16"/>
+                <w:vertAlign w:val="superscript"/>
+              </w:rPr>
+              <w:t xml:space="preserve">***</w:t>
+            </w:r>
+          </w:p>
+        </w:tc>
+        <w:tc>
+          <w:tcPr>
+            <w:tcW w:w="1200" w:type="dxa"/>
+            <w:vAlign w:val="center"/>
+          </w:tcPr>
+          <w:p>
+            <w:pPr>
+              <w:keepNext/>
+              <w:keepLines/>
+              <w:spacing w:before="30" w:after="30" w:line="240" w:lineRule="auto"/>
+              <w:ind w:firstLine="0"/>
+              <w:jc w:val="right"/>
+            </w:pPr>
+            <w:r>
+              <w:rPr>
+                <w:sz w:val="16"/>
+                <w:szCs w:val="16"/>
+              </w:rPr>
+              <w:t xml:space="preserve">−0,0170</w:t>
+            </w:r>
+            <w:r>
+              <w:rPr>
+                <w:sz w:val="16"/>
+                <w:szCs w:val="16"/>
+                <w:vertAlign w:val="superscript"/>
+              </w:rPr>
+              <w:t xml:space="preserve">***</w:t>
+            </w:r>
+          </w:p>
+        </w:tc>
+        <w:tc>
+          <w:tcPr>
+            <w:tcW w:w="1000" w:type="dxa"/>
+            <w:vAlign w:val="center"/>
+          </w:tcPr>
+          <w:p>
+            <w:pPr>
+              <w:keepNext/>
+              <w:keepLines/>
+              <w:spacing w:before="30" w:after="30" w:line="240" w:lineRule="auto"/>
+              <w:ind w:firstLine="0"/>
+              <w:jc w:val="right"/>
+            </w:pPr>
+            <w:r>
+              <w:rPr>
+                <w:sz w:val="16"/>
+                <w:szCs w:val="16"/>
+              </w:rPr>
+              <w:t xml:space="preserve">−0,0133</w:t>
+            </w:r>
+          </w:p>
+        </w:tc>
+        <w:tc>
+          <w:tcPr>
+            <w:tcW w:w="2088" w:type="dxa"/>
+            <w:vAlign w:val="center"/>
+          </w:tcPr>
+          <w:p>
+            <w:pPr>
+              <w:keepNext/>
+              <w:keepLines/>
+              <w:spacing w:before="30" w:after="30" w:line="240" w:lineRule="auto"/>
+              <w:ind w:firstLine="0"/>
+              <w:jc w:val="left"/>
+            </w:pPr>
+            <w:r>
+              <w:rPr>
+                <w:sz w:val="16"/>
+                <w:szCs w:val="16"/>
+              </w:rPr>
+              <w:t xml:space="preserve">estável</w:t>
+            </w:r>
+          </w:p>
+        </w:tc>
+      </w:tr>
+      <w:tr>
+        <w:trPr>
+          <w:cantSplit/>
         </w:trPr>
         <w:tc>
           <w:tcPr>
@@ -3607,13 +3570,15 @@
           <w:p>
             <w:pPr>
               <w:spacing w:before="30" w:after="30" w:line="240" w:lineRule="auto"/>
+              <w:ind w:firstLine="0"/>
+              <w:jc w:val="left"/>
             </w:pPr>
             <w:r>
               <w:rPr>
                 <w:sz w:val="16"/>
                 <w:szCs w:val="16"/>
               </w:rPr>
-              <w:t>Z-score</w:t>
+              <w:t xml:space="preserve">Z-score</w:t>
             </w:r>
           </w:p>
         </w:tc>
@@ -3625,6 +3590,7 @@
           <w:p>
             <w:pPr>
               <w:spacing w:before="30" w:after="30" w:line="240" w:lineRule="auto"/>
+              <w:ind w:firstLine="0"/>
               <w:jc w:val="right"/>
             </w:pPr>
             <w:r>
@@ -3632,7 +3598,7 @@
                 <w:sz w:val="16"/>
                 <w:szCs w:val="16"/>
               </w:rPr>
-              <w:t>4,20</w:t>
+              <w:t xml:space="preserve">4,20</w:t>
             </w:r>
             <w:r>
               <w:rPr>
@@ -3640,7 +3606,7 @@
                 <w:szCs w:val="16"/>
                 <w:vertAlign w:val="superscript"/>
               </w:rPr>
-              <w:t>***</w:t>
+              <w:t xml:space="preserve">***</w:t>
             </w:r>
           </w:p>
         </w:tc>
@@ -3652,6 +3618,7 @@
           <w:p>
             <w:pPr>
               <w:spacing w:before="30" w:after="30" w:line="240" w:lineRule="auto"/>
+              <w:ind w:firstLine="0"/>
               <w:jc w:val="right"/>
             </w:pPr>
             <w:r>
@@ -3659,7 +3626,7 @@
                 <w:sz w:val="16"/>
                 <w:szCs w:val="16"/>
               </w:rPr>
-              <w:t>6,32</w:t>
+              <w:t xml:space="preserve">6,32</w:t>
             </w:r>
             <w:r>
               <w:rPr>
@@ -3667,7 +3634,7 @@
                 <w:szCs w:val="16"/>
                 <w:vertAlign w:val="superscript"/>
               </w:rPr>
-              <w:t>***</w:t>
+              <w:t xml:space="preserve">***</w:t>
             </w:r>
           </w:p>
         </w:tc>
@@ -3679,6 +3646,7 @@
           <w:p>
             <w:pPr>
               <w:spacing w:before="30" w:after="30" w:line="240" w:lineRule="auto"/>
+              <w:ind w:firstLine="0"/>
               <w:jc w:val="right"/>
             </w:pPr>
             <w:r>
@@ -3686,7 +3654,7 @@
                 <w:sz w:val="16"/>
                 <w:szCs w:val="16"/>
               </w:rPr>
-              <w:t>6,14</w:t>
+              <w:t xml:space="preserve">6,14</w:t>
             </w:r>
             <w:r>
               <w:rPr>
@@ -3694,7 +3662,7 @@
                 <w:szCs w:val="16"/>
                 <w:vertAlign w:val="superscript"/>
               </w:rPr>
-              <w:t>***</w:t>
+              <w:t xml:space="preserve">***</w:t>
             </w:r>
           </w:p>
         </w:tc>
@@ -3706,6 +3674,7 @@
           <w:p>
             <w:pPr>
               <w:spacing w:before="30" w:after="30" w:line="240" w:lineRule="auto"/>
+              <w:ind w:firstLine="0"/>
               <w:jc w:val="right"/>
             </w:pPr>
             <w:r>
@@ -3713,7 +3682,7 @@
                 <w:sz w:val="16"/>
                 <w:szCs w:val="16"/>
               </w:rPr>
-              <w:t>6,20</w:t>
+              <w:t xml:space="preserve">6,20</w:t>
             </w:r>
             <w:r>
               <w:rPr>
@@ -3721,7 +3690,7 @@
                 <w:szCs w:val="16"/>
                 <w:vertAlign w:val="superscript"/>
               </w:rPr>
-              <w:t>***</w:t>
+              <w:t xml:space="preserve">***</w:t>
             </w:r>
           </w:p>
         </w:tc>
@@ -3733,6 +3702,7 @@
           <w:p>
             <w:pPr>
               <w:spacing w:before="30" w:after="30" w:line="240" w:lineRule="auto"/>
+              <w:ind w:firstLine="0"/>
               <w:jc w:val="right"/>
             </w:pPr>
             <w:r>
@@ -3740,7 +3710,7 @@
                 <w:sz w:val="16"/>
                 <w:szCs w:val="16"/>
               </w:rPr>
-              <w:t>7,58</w:t>
+              <w:t xml:space="preserve">7,58</w:t>
             </w:r>
           </w:p>
         </w:tc>
@@ -3752,16 +3722,16 @@
           <w:p>
             <w:pPr>
               <w:spacing w:before="30" w:after="30" w:line="240" w:lineRule="auto"/>
+              <w:ind w:firstLine="0"/>
+              <w:jc w:val="left"/>
             </w:pPr>
-            <w:proofErr w:type="spellStart"/>
-            <w:r>
-              <w:rPr>
-                <w:sz w:val="16"/>
-                <w:szCs w:val="16"/>
-              </w:rPr>
-              <w:t>estável</w:t>
-            </w:r>
-            <w:proofErr w:type="spellEnd"/>
+            <w:r>
+              <w:rPr>
+                <w:sz w:val="16"/>
+                <w:szCs w:val="16"/>
+              </w:rPr>
+              <w:t xml:space="preserve">estável</w:t>
+            </w:r>
           </w:p>
         </w:tc>
       </w:tr>
@@ -4854,7 +4824,7 @@
         <w:rPr>
           <w:lang w:val="pt-BR"/>
         </w:rPr>
-        <w:t xml:space="preserve">. O argumento do maior retorno sobre o ativo </w:t>
+        <w:t xml:space="preserve">. Em rentabilidade, o argumento correto é o do </w:t>
       </w:r>
       <w:r>
         <w:rPr>
@@ -4862,13 +4832,13 @@
           <w:bCs/>
           <w:lang w:val="pt-BR"/>
         </w:rPr>
-        <w:t xml:space="preserve">vale após impostos</w:t>
-      </w:r>
-      <w:r>
-        <w:rPr>
-          <w:lang w:val="pt-BR"/>
-        </w:rPr>
-        <w:t xml:space="preserve">; antes da tributação, a diferença é menor e não está estabelecida. O argumento de que as cooperativas provisionam de forma mais conservadora que os bancos </w:t>
+        <w:t xml:space="preserve">retorno retido</w:t>
+      </w:r>
+      <w:r>
+        <w:rPr>
+          <w:lang w:val="pt-BR"/>
+        </w:rPr>
+        <w:t xml:space="preserve">, que é maior após os tributos; antes deles, a diferença é pequena e não está estabelecida. O argumento de que as cooperativas provisionam de forma mais conservadora que os bancos </w:t>
       </w:r>
       <w:r>
         <w:rPr>
@@ -4883,6 +4853,42 @@
           <w:lang w:val="pt-BR"/>
         </w:rPr>
         <w:t xml:space="preserve">. O argumento da maior participação do crédito no ativo vale em relação ao conjunto dos bancos do país, mas ainda não foi demonstrado dentro dos mercados regionais.</w:t>
+      </w:r>
+    </w:p>
+    <w:p>
+      <w:pPr>
+        <w:spacing w:after="120"/>
+        <w:ind w:firstLine="720"/>
+        <w:jc w:val="both"/>
+        <w:rPr>
+          <w:lang w:val="pt-BR"/>
+        </w:rPr>
+      </w:pPr>
+      <w:r>
+        <w:rPr>
+          <w:lang w:val="pt-BR"/>
+        </w:rPr>
+        <w:t xml:space="preserve">O tratamento tributário do ato cooperativo é a diferença de regras que a metodologia prudencial comum não remove, e os resultados mostram onde ela atua. A isenção de IRPJ e CSLL (Lei 5.764/1971, art. 111; Lei 10.865/2004, art. 39) aparece no retorno retido, que é o único capital que uma cooperativa pode construir, e não aparece nem na margem de intermediação nem no retorno antes dos tributos, que são equivalentes aos dos bancos de mesmo porte. </w:t>
+      </w:r>
+      <w:r>
+        <w:rPr>
+          <w:lang w:val="pt-BR"/>
+        </w:rPr>
+        <w:t xml:space="preserve">A cooperativa retém mais, e o que retém fica na instituição, a serviço do crédito aos associados. Na operação, ela cobra e ganha o mesmo que os bancos de mesmo porte, e por isso </w:t>
+      </w:r>
+      <w:r>
+        <w:rPr>
+          <w:b/>
+          <w:bCs/>
+          <w:lang w:val="pt-BR"/>
+        </w:rPr>
+        <w:t xml:space="preserve">os dados não sustentam a leitura de vantagem competitiva indevida</w:t>
+      </w:r>
+      <w:r>
+        <w:rPr>
+          <w:lang w:val="pt-BR"/>
+        </w:rPr>
+        <w:t xml:space="preserve">. Pela alíquota efetiva mediana dos bancos, o retorno líquido mediano das cooperativas cairia de cerca de 2,9% para cerca de 2%, e o capital se acumularia cerca de três décimos mais devagar. Lido junto com o FGCoop, fundo privado financiado pelas próprias cooperativas, o regime do ato cooperativo integra a mesma arquitetura: o setor financia o próprio colchão de capital e a própria rede de proteção.</w:t>
       </w:r>
     </w:p>
     <w:p>
@@ -5156,13 +5162,46 @@
           <w:bCs/>
           <w:lang w:val="pt-BR"/>
         </w:rPr>
-        <w:t xml:space="preserve">custo e estabilidade dos retornos</w:t>
-      </w:r>
-      <w:r>
-        <w:rPr>
-          <w:lang w:val="pt-BR"/>
-        </w:rPr>
-        <w:t xml:space="preserve">, com a rentabilidade apresentada como resultado após impostos.</w:t>
+        <w:t xml:space="preserve">custo, estabilidade dos retornos e retorno retido após os tributos</w:t>
+      </w:r>
+      <w:r>
+        <w:rPr>
+          <w:lang w:val="pt-BR"/>
+        </w:rPr>
+        <w:t xml:space="preserve">, apresentando a rentabilidade operacional como equivalente à dos bancos.</w:t>
+      </w:r>
+    </w:p>
+    <w:p>
+      <w:pPr>
+        <w:pStyle w:val="PargrafodaLista"/>
+        <w:numPr>
+          <w:ilvl w:val="0"/>
+          <w:numId w:val="14"/>
+        </w:numPr>
+        <w:jc w:val="both"/>
+        <w:rPr>
+          <w:lang w:val="pt-BR"/>
+        </w:rPr>
+      </w:pPr>
+      <w:r>
+        <w:rPr>
+          <w:lang w:val="pt-BR"/>
+        </w:rPr>
+        <w:t xml:space="preserve">Usar o estudo na defesa do tratamento tributário do ato cooperativo: </w:t>
+      </w:r>
+      <w:r>
+        <w:rPr>
+          <w:b/>
+          <w:bCs/>
+          <w:lang w:val="pt-BR"/>
+        </w:rPr>
+        <w:t xml:space="preserve">a isenção se converte em capital retido, com rentabilidade operacional equivalente à dos bancos</w:t>
+      </w:r>
+      <w:r>
+        <w:rPr>
+          <w:lang w:val="pt-BR"/>
+        </w:rPr>
+        <w:t xml:space="preserve">, e esse capital sustenta o crédito aos associados e é financiado, junto com o FGCoop, pelo próprio setor.</w:t>
       </w:r>
     </w:p>
     <w:p>

</xml_diff>

<commit_message>
Bressan et al. (2011) DOI corrected from the PDF; whitepaper level with the paper's pre-tax wording
Co-Authored-By: Claude Fable 5.1 <noreply@anthropic.com>
</commit_message>
<xml_diff>
--- a/paper/Coops vs Bancos (Basileia) - White Paper 2026 (1).docx
+++ b/paper/Coops vs Bancos (Basileia) - White Paper 2026 (1).docx
@@ -248,7 +248,7 @@
           <w:color w:val="000000"/>
           <w:lang w:val="pt-BR"/>
         </w:rPr>
-        <w:t xml:space="preserve"> que os bancos. Antes dos tributos, o retorno sobre o ativo é </w:t>
+        <w:t xml:space="preserve"> que os bancos. Antes dos tributos, a cooperativa típica já ganha </w:t>
       </w:r>
       <w:r>
         <w:rPr>
@@ -257,14 +257,14 @@
           <w:color w:val="000000"/>
           <w:lang w:val="pt-BR"/>
         </w:rPr>
-        <w:t xml:space="preserve">semelhante ao dos bancos</w:t>
+        <w:t xml:space="preserve">um pouco mais</w:t>
       </w:r>
       <w:r>
         <w:rPr>
           <w:color w:val="000000"/>
           <w:lang w:val="pt-BR"/>
         </w:rPr>
-        <w:t xml:space="preserve">; depois deles, a cooperativa </w:t>
+        <w:t xml:space="preserve"> que um banco de mesmo porte, embora a diferença média não se sustente em todas as especificações; depois deles, </w:t>
       </w:r>
       <w:r>
         <w:rPr>
@@ -273,14 +273,14 @@
           <w:color w:val="000000"/>
           <w:lang w:val="pt-BR"/>
         </w:rPr>
-        <w:t xml:space="preserve">retém mais</w:t>
+        <w:t xml:space="preserve">retém cerca de dois pontos percentuais a mais</w:t>
       </w:r>
       <w:r>
         <w:rPr>
           <w:color w:val="000000"/>
           <w:lang w:val="pt-BR"/>
         </w:rPr>
-        <w:t xml:space="preserve">, porque o ato cooperativo é isento de IRPJ e CSLL, e o que ela retém é o único capital que pode construir. Na média, coops têm menos capital, mas porque a média dos bancos é puxada para cima por bancos pequenos com capital muito acima do exigido.</w:t>
+        <w:t xml:space="preserve">, dos quais a isenção do ato cooperativo explica cerca de dois quintos, e o que ela retém é o único capital que pode construir. Na média, coops têm menos capital, mas porque a média dos bancos é puxada para cima por bancos pequenos com capital muito acima do exigido.</w:t>
       </w:r>
     </w:p>
     <w:p>
@@ -424,7 +424,7 @@
         <w:rPr>
           <w:lang w:val="pt-BR"/>
         </w:rPr>
-        <w:t xml:space="preserve">; antes dos tributos, o retorno sobre o ativo é semelhante ao dos bancos e, depois deles, cerca de dois pontos percentuais maior, em boa parte pela </w:t>
+        <w:t xml:space="preserve">; antes dos tributos, a cooperativa típica ganha um pouco mais que um banco de mesmo porte e, depois deles, cerca de dois pontos percentuais a mais, dos quais cerca de dois quintos vêm da </w:t>
       </w:r>
       <w:r>
         <w:rPr>
@@ -1475,7 +1475,7 @@
         <w:rPr>
           <w:lang w:val="pt-BR"/>
         </w:rPr>
-        <w:t xml:space="preserve">A rentabilidade se divide em dois canais, e a Tabela 1 traz os dois. Antes dos tributos, a diferença de retorno sobre o ativo é positiva nas quatro especificações, mas significativa apenas nas duas primeiras, e por isso é classificada como nula: em termos operacionais, as maiores cooperativas ganham aproximadamente o que ganham os bancos de mesmo porte, sobre uma margem de intermediação que não difere da deles. Depois dos tributos, a diferença é de cerca de dois pontos percentuais com controle de porte, significativa em todas as especificações e estável. A distância entre as duas linhas é a isenção do ato cooperativo: entre os trimestres com resultado positivo antes dos tributos, a alíquota efetiva mediana de IRPJ e CSLL é de cerca de um terço para os bancos e próxima de zero para as cooperativas, e a diferença antes dos tributos equivale a cerca de três quintos da diferença depois deles. A linha após impostos mede o que a cooperativa retém, o retorno que se acumula como capital; a linha antes dos impostos é a comparação operacional.</w:t>
+        <w:t xml:space="preserve">A rentabilidade se divide em dois canais, e a Tabela 1 traz os dois. Antes dos tributos, a diferença de retorno sobre o ativo é positiva nas quatro especificações, mas significativa apenas nas duas primeiras, e por isso é classificada como nula. A classificação vem da média: na mediana condicional, a cooperativa ganha 1,4 ponto percentual a mais que um banco de mesmo porte, com intervalo de confiança que exclui zero, e a diferença só se torna negativa no decil superior, onde está uma cauda de bancos de retorno muito alto que puxa a média para zero, o mesmo padrão observado no capital. A cooperativa típica, portanto, já ganha mais antes dos tributos, sobre uma margem de intermediação que não difere da dos bancos, enquanto a diferença média não está estabelecida. Depois dos tributos, a diferença é de cerca de dois pontos percentuais com controle de porte, significativa em todas as especificações e estável. A distância entre as duas linhas é a isenção do ato cooperativo: entre os trimestres com resultado positivo antes dos tributos, a alíquota efetiva mediana de IRPJ e CSLL é de cerca de um terço para os bancos e próxima de zero para as cooperativas, e a diferença antes dos tributos equivale a cerca de três quintos da diferença depois deles, de modo que a isenção responde por cerca de dois quintos. A linha após impostos mede o que a cooperativa retém, o retorno que se acumula como capital; a linha antes dos impostos é a comparação operacional.</w:t>
       </w:r>
     </w:p>
     <w:p>
@@ -4824,7 +4824,7 @@
         <w:rPr>
           <w:lang w:val="pt-BR"/>
         </w:rPr>
-        <w:t xml:space="preserve">. Em rentabilidade, o argumento correto é o do </w:t>
+        <w:t xml:space="preserve">. Em rentabilidade, o argumento mais seguro é o do </w:t>
       </w:r>
       <w:r>
         <w:rPr>
@@ -4838,7 +4838,7 @@
         <w:rPr>
           <w:lang w:val="pt-BR"/>
         </w:rPr>
-        <w:t xml:space="preserve">, que é maior após os tributos; antes deles, a diferença é pequena e não está estabelecida. O argumento de que as cooperativas provisionam de forma mais conservadora que os bancos </w:t>
+        <w:t xml:space="preserve">, maior após os tributos; antes deles, a cooperativa típica ganha mais na mediana, mas a diferença média não está estabelecida. O argumento de que as cooperativas provisionam de forma mais conservadora que os bancos </w:t>
       </w:r>
       <w:r>
         <w:rPr>
@@ -4868,13 +4868,7 @@
         <w:rPr>
           <w:lang w:val="pt-BR"/>
         </w:rPr>
-        <w:t xml:space="preserve">O tratamento tributário do ato cooperativo é a diferença de regras que a metodologia prudencial comum não remove, e os resultados mostram onde ela atua. A isenção de IRPJ e CSLL (Lei 5.764/1971, art. 111; Lei 10.865/2004, art. 39) aparece no retorno retido, que é o único capital que uma cooperativa pode construir, e não aparece nem na margem de intermediação nem no retorno antes dos tributos, que são equivalentes aos dos bancos de mesmo porte. </w:t>
-      </w:r>
-      <w:r>
-        <w:rPr>
-          <w:lang w:val="pt-BR"/>
-        </w:rPr>
-        <w:t xml:space="preserve">A cooperativa retém mais, e o que retém fica na instituição, a serviço do crédito aos associados. Na operação, ela cobra e ganha o mesmo que os bancos de mesmo porte, e por isso </w:t>
+        <w:t xml:space="preserve">O tratamento tributário do ato cooperativo é a diferença de regras que a metodologia prudencial comum não remove, e os resultados mostram onde ela atua. A isenção de IRPJ e CSLL (Lei 5.764/1971, art. 111; Lei 10.865/2004, art. 39) responde por cerca de dois quintos da diferença de retorno após os tributos; o restante aparece antes deles, na mediana, sobre uma margem de intermediação que não difere da dos bancos. A cooperativa retém mais, e o que retém fica na instituição, a serviço do crédito aos associados. Na operação, ela pratica a mesma margem que os bancos de mesmo porte e ganha um pouco mais pela maior participação do crédito e pelo menor custo, e por isso </w:t>
       </w:r>
       <w:r>
         <w:rPr>
@@ -4888,7 +4882,7 @@
         <w:rPr>
           <w:lang w:val="pt-BR"/>
         </w:rPr>
-        <w:t xml:space="preserve">. Pela alíquota efetiva mediana dos bancos, o retorno líquido mediano das cooperativas cairia de cerca de 2,9% para cerca de 2%, e o capital se acumularia cerca de três décimos mais devagar. Lido junto com o FGCoop, fundo privado financiado pelas próprias cooperativas, o regime do ato cooperativo integra a mesma arquitetura: o setor financia o próprio colchão de capital e a própria rede de proteção.</w:t>
+        <w:t xml:space="preserve">. Pela alíquota efetiva mediana dos bancos, o retorno líquido mediano das cooperativas cairia de cerca de 2,9% para cerca de 2%, e o capital se acumularia cerca de três décimos mais devagar, mantida a distribuição de sobras aos associados. Há quem leia a isenção como renúncia de receita pública; os dados mostram que ela se converte em capital retido a serviço do crédito e que, como o FGCoop, fundo privado financiado pelas próprias cooperativas, integra uma arquitetura em que o setor financia o próprio colchão de capital e a própria rede de proteção.</w:t>
       </w:r>
     </w:p>
     <w:p>
@@ -5168,7 +5162,7 @@
         <w:rPr>
           <w:lang w:val="pt-BR"/>
         </w:rPr>
-        <w:t xml:space="preserve">, apresentando a rentabilidade operacional como equivalente à dos bancos.</w:t>
+        <w:t xml:space="preserve">, apresentando a rentabilidade operacional como um pouco maior na mediana e equivalente na média.</w:t>
       </w:r>
     </w:p>
     <w:p>
@@ -5195,13 +5189,13 @@
           <w:bCs/>
           <w:lang w:val="pt-BR"/>
         </w:rPr>
-        <w:t xml:space="preserve">a isenção se converte em capital retido, com rentabilidade operacional equivalente à dos bancos</w:t>
-      </w:r>
-      <w:r>
-        <w:rPr>
-          <w:lang w:val="pt-BR"/>
-        </w:rPr>
-        <w:t xml:space="preserve">, e esse capital sustenta o crédito aos associados e é financiado, junto com o FGCoop, pelo próprio setor.</w:t>
+        <w:t xml:space="preserve">a isenção responde por cerca de dois quintos do retorno retido a mais e se converte em capital</w:t>
+      </w:r>
+      <w:r>
+        <w:rPr>
+          <w:lang w:val="pt-BR"/>
+        </w:rPr>
+        <w:t xml:space="preserve">, sobre a mesma margem de intermediação dos bancos; esse capital sustenta o crédito aos associados e é financiado, junto com o FGCoop, pelo próprio setor.</w:t>
       </w:r>
     </w:p>
     <w:p>

</xml_diff>